<commit_message>
cite the unit's lecture notes where the report draws on them
</commit_message>
<xml_diff>
--- a/reports/a4/PRT565 A4 Report Group85.docx
+++ b/reports/a4/PRT565 A4 Report Group85.docx
@@ -550,7 +550,7 @@
               <w:rPr>
                 <w:sz w:val="22"/>
               </w:rPr>
-              <w:t>3,121</w:t>
+              <w:t>3,126</w:t>
             </w:r>
           </w:p>
         </w:tc>
@@ -606,7 +606,7 @@
               <w:rPr>
                 <w:sz w:val="22"/>
               </w:rPr>
-              <w:t>1,635</w:t>
+              <w:t>1,637</w:t>
             </w:r>
           </w:p>
         </w:tc>
@@ -662,7 +662,7 @@
               <w:rPr>
                 <w:sz w:val="22"/>
               </w:rPr>
-              <w:t>1,557</w:t>
+              <w:t>1,559</w:t>
             </w:r>
           </w:p>
         </w:tc>
@@ -714,7 +714,7 @@
                 <w:b/>
                 <w:sz w:val="22"/>
               </w:rPr>
-              <w:t>6,313</w:t>
+              <w:t>6,322</w:t>
             </w:r>
           </w:p>
         </w:tc>
@@ -754,7 +754,7 @@
       <w:r>
         <w:fldChar w:fldCharType="separate"/>
       </w:r>
-      <w:hyperlink w:anchor="_Toc242543142" w:history="1">
+      <w:hyperlink w:anchor="_Toc242544611" w:history="1">
         <w:r>
           <w:rPr>
             <w:rStyle w:val="Hyperlink"/>
@@ -781,7 +781,7 @@
             <w:noProof/>
             <w:webHidden/>
           </w:rPr>
-          <w:instrText xml:space="preserve"> PAGEREF _Toc242543142 \h </w:instrText>
+          <w:instrText xml:space="preserve"> PAGEREF _Toc242544611 \h </w:instrText>
         </w:r>
         <w:r>
           <w:rPr>
@@ -826,7 +826,7 @@
           <w14:ligatures w14:val="standardContextual"/>
         </w:rPr>
       </w:pPr>
-      <w:hyperlink w:anchor="_Toc242543143" w:history="1">
+      <w:hyperlink w:anchor="_Toc242544612" w:history="1">
         <w:r>
           <w:rPr>
             <w:rStyle w:val="Hyperlink"/>
@@ -853,7 +853,7 @@
             <w:noProof/>
             <w:webHidden/>
           </w:rPr>
-          <w:instrText xml:space="preserve"> PAGEREF _Toc242543143 \h </w:instrText>
+          <w:instrText xml:space="preserve"> PAGEREF _Toc242544612 \h </w:instrText>
         </w:r>
         <w:r>
           <w:rPr>
@@ -898,7 +898,7 @@
           <w14:ligatures w14:val="standardContextual"/>
         </w:rPr>
       </w:pPr>
-      <w:hyperlink w:anchor="_Toc242543144" w:history="1">
+      <w:hyperlink w:anchor="_Toc242544613" w:history="1">
         <w:r>
           <w:rPr>
             <w:rStyle w:val="Hyperlink"/>
@@ -925,7 +925,7 @@
             <w:noProof/>
             <w:webHidden/>
           </w:rPr>
-          <w:instrText xml:space="preserve"> PAGEREF _Toc242543144 \h </w:instrText>
+          <w:instrText xml:space="preserve"> PAGEREF _Toc242544613 \h </w:instrText>
         </w:r>
         <w:r>
           <w:rPr>
@@ -971,7 +971,7 @@
           <w14:ligatures w14:val="standardContextual"/>
         </w:rPr>
       </w:pPr>
-      <w:hyperlink w:anchor="_Toc242543145" w:history="1">
+      <w:hyperlink w:anchor="_Toc242544614" w:history="1">
         <w:r>
           <w:rPr>
             <w:rStyle w:val="Hyperlink"/>
@@ -998,7 +998,7 @@
             <w:noProof/>
             <w:webHidden/>
           </w:rPr>
-          <w:instrText xml:space="preserve"> PAGEREF _Toc242543145 \h </w:instrText>
+          <w:instrText xml:space="preserve"> PAGEREF _Toc242544614 \h </w:instrText>
         </w:r>
         <w:r>
           <w:rPr>
@@ -1043,7 +1043,7 @@
           <w14:ligatures w14:val="standardContextual"/>
         </w:rPr>
       </w:pPr>
-      <w:hyperlink w:anchor="_Toc242543146" w:history="1">
+      <w:hyperlink w:anchor="_Toc242544615" w:history="1">
         <w:r>
           <w:rPr>
             <w:rStyle w:val="Hyperlink"/>
@@ -1070,7 +1070,7 @@
             <w:noProof/>
             <w:webHidden/>
           </w:rPr>
-          <w:instrText xml:space="preserve"> PAGEREF _Toc242543146 \h </w:instrText>
+          <w:instrText xml:space="preserve"> PAGEREF _Toc242544615 \h </w:instrText>
         </w:r>
         <w:r>
           <w:rPr>
@@ -1115,7 +1115,7 @@
           <w14:ligatures w14:val="standardContextual"/>
         </w:rPr>
       </w:pPr>
-      <w:hyperlink w:anchor="_Toc242543147" w:history="1">
+      <w:hyperlink w:anchor="_Toc242544616" w:history="1">
         <w:r>
           <w:rPr>
             <w:rStyle w:val="Hyperlink"/>
@@ -1142,7 +1142,7 @@
             <w:noProof/>
             <w:webHidden/>
           </w:rPr>
-          <w:instrText xml:space="preserve"> PAGEREF _Toc242543147 \h </w:instrText>
+          <w:instrText xml:space="preserve"> PAGEREF _Toc242544616 \h </w:instrText>
         </w:r>
         <w:r>
           <w:rPr>
@@ -1188,7 +1188,7 @@
           <w14:ligatures w14:val="standardContextual"/>
         </w:rPr>
       </w:pPr>
-      <w:hyperlink w:anchor="_Toc242543148" w:history="1">
+      <w:hyperlink w:anchor="_Toc242544617" w:history="1">
         <w:r>
           <w:rPr>
             <w:rStyle w:val="Hyperlink"/>
@@ -1215,7 +1215,7 @@
             <w:noProof/>
             <w:webHidden/>
           </w:rPr>
-          <w:instrText xml:space="preserve"> PAGEREF _Toc242543148 \h </w:instrText>
+          <w:instrText xml:space="preserve"> PAGEREF _Toc242544617 \h </w:instrText>
         </w:r>
         <w:r>
           <w:rPr>
@@ -1260,7 +1260,7 @@
           <w14:ligatures w14:val="standardContextual"/>
         </w:rPr>
       </w:pPr>
-      <w:hyperlink w:anchor="_Toc242543149" w:history="1">
+      <w:hyperlink w:anchor="_Toc242544618" w:history="1">
         <w:r>
           <w:rPr>
             <w:rStyle w:val="Hyperlink"/>
@@ -1287,7 +1287,7 @@
             <w:noProof/>
             <w:webHidden/>
           </w:rPr>
-          <w:instrText xml:space="preserve"> PAGEREF _Toc242543149 \h </w:instrText>
+          <w:instrText xml:space="preserve"> PAGEREF _Toc242544618 \h </w:instrText>
         </w:r>
         <w:r>
           <w:rPr>
@@ -1332,7 +1332,7 @@
           <w14:ligatures w14:val="standardContextual"/>
         </w:rPr>
       </w:pPr>
-      <w:hyperlink w:anchor="_Toc242543150" w:history="1">
+      <w:hyperlink w:anchor="_Toc242544619" w:history="1">
         <w:r>
           <w:rPr>
             <w:rStyle w:val="Hyperlink"/>
@@ -1359,7 +1359,7 @@
             <w:noProof/>
             <w:webHidden/>
           </w:rPr>
-          <w:instrText xml:space="preserve"> PAGEREF _Toc242543150 \h </w:instrText>
+          <w:instrText xml:space="preserve"> PAGEREF _Toc242544619 \h </w:instrText>
         </w:r>
         <w:r>
           <w:rPr>
@@ -1404,7 +1404,7 @@
           <w14:ligatures w14:val="standardContextual"/>
         </w:rPr>
       </w:pPr>
-      <w:hyperlink w:anchor="_Toc242543151" w:history="1">
+      <w:hyperlink w:anchor="_Toc242544620" w:history="1">
         <w:r>
           <w:rPr>
             <w:rStyle w:val="Hyperlink"/>
@@ -1431,7 +1431,7 @@
             <w:noProof/>
             <w:webHidden/>
           </w:rPr>
-          <w:instrText xml:space="preserve"> PAGEREF _Toc242543151 \h </w:instrText>
+          <w:instrText xml:space="preserve"> PAGEREF _Toc242544620 \h </w:instrText>
         </w:r>
         <w:r>
           <w:rPr>
@@ -1476,7 +1476,7 @@
           <w14:ligatures w14:val="standardContextual"/>
         </w:rPr>
       </w:pPr>
-      <w:hyperlink w:anchor="_Toc242543152" w:history="1">
+      <w:hyperlink w:anchor="_Toc242544621" w:history="1">
         <w:r>
           <w:rPr>
             <w:rStyle w:val="Hyperlink"/>
@@ -1503,7 +1503,7 @@
             <w:noProof/>
             <w:webHidden/>
           </w:rPr>
-          <w:instrText xml:space="preserve"> PAGEREF _Toc242543152 \h </w:instrText>
+          <w:instrText xml:space="preserve"> PAGEREF _Toc242544621 \h </w:instrText>
         </w:r>
         <w:r>
           <w:rPr>
@@ -1549,7 +1549,7 @@
           <w14:ligatures w14:val="standardContextual"/>
         </w:rPr>
       </w:pPr>
-      <w:hyperlink w:anchor="_Toc242543153" w:history="1">
+      <w:hyperlink w:anchor="_Toc242544622" w:history="1">
         <w:r>
           <w:rPr>
             <w:rStyle w:val="Hyperlink"/>
@@ -1576,7 +1576,7 @@
             <w:noProof/>
             <w:webHidden/>
           </w:rPr>
-          <w:instrText xml:space="preserve"> PAGEREF _Toc242543153 \h </w:instrText>
+          <w:instrText xml:space="preserve"> PAGEREF _Toc242544622 \h </w:instrText>
         </w:r>
         <w:r>
           <w:rPr>
@@ -1621,7 +1621,7 @@
           <w14:ligatures w14:val="standardContextual"/>
         </w:rPr>
       </w:pPr>
-      <w:hyperlink w:anchor="_Toc242543154" w:history="1">
+      <w:hyperlink w:anchor="_Toc242544623" w:history="1">
         <w:r>
           <w:rPr>
             <w:rStyle w:val="Hyperlink"/>
@@ -1648,7 +1648,7 @@
             <w:noProof/>
             <w:webHidden/>
           </w:rPr>
-          <w:instrText xml:space="preserve"> PAGEREF _Toc242543154 \h </w:instrText>
+          <w:instrText xml:space="preserve"> PAGEREF _Toc242544623 \h </w:instrText>
         </w:r>
         <w:r>
           <w:rPr>
@@ -1693,7 +1693,7 @@
           <w14:ligatures w14:val="standardContextual"/>
         </w:rPr>
       </w:pPr>
-      <w:hyperlink w:anchor="_Toc242543155" w:history="1">
+      <w:hyperlink w:anchor="_Toc242544624" w:history="1">
         <w:r>
           <w:rPr>
             <w:rStyle w:val="Hyperlink"/>
@@ -1720,7 +1720,7 @@
             <w:noProof/>
             <w:webHidden/>
           </w:rPr>
-          <w:instrText xml:space="preserve"> PAGEREF _Toc242543155 \h </w:instrText>
+          <w:instrText xml:space="preserve"> PAGEREF _Toc242544624 \h </w:instrText>
         </w:r>
         <w:r>
           <w:rPr>
@@ -1765,7 +1765,7 @@
           <w14:ligatures w14:val="standardContextual"/>
         </w:rPr>
       </w:pPr>
-      <w:hyperlink w:anchor="_Toc242543156" w:history="1">
+      <w:hyperlink w:anchor="_Toc242544625" w:history="1">
         <w:r>
           <w:rPr>
             <w:rStyle w:val="Hyperlink"/>
@@ -1792,7 +1792,7 @@
             <w:noProof/>
             <w:webHidden/>
           </w:rPr>
-          <w:instrText xml:space="preserve"> PAGEREF _Toc242543156 \h </w:instrText>
+          <w:instrText xml:space="preserve"> PAGEREF _Toc242544625 \h </w:instrText>
         </w:r>
         <w:r>
           <w:rPr>
@@ -1837,7 +1837,7 @@
           <w14:ligatures w14:val="standardContextual"/>
         </w:rPr>
       </w:pPr>
-      <w:hyperlink w:anchor="_Toc242543157" w:history="1">
+      <w:hyperlink w:anchor="_Toc242544626" w:history="1">
         <w:r>
           <w:rPr>
             <w:rStyle w:val="Hyperlink"/>
@@ -1864,7 +1864,7 @@
             <w:noProof/>
             <w:webHidden/>
           </w:rPr>
-          <w:instrText xml:space="preserve"> PAGEREF _Toc242543157 \h </w:instrText>
+          <w:instrText xml:space="preserve"> PAGEREF _Toc242544626 \h </w:instrText>
         </w:r>
         <w:r>
           <w:rPr>
@@ -1909,7 +1909,7 @@
           <w14:ligatures w14:val="standardContextual"/>
         </w:rPr>
       </w:pPr>
-      <w:hyperlink w:anchor="_Toc242543158" w:history="1">
+      <w:hyperlink w:anchor="_Toc242544627" w:history="1">
         <w:r>
           <w:rPr>
             <w:rStyle w:val="Hyperlink"/>
@@ -1936,7 +1936,7 @@
             <w:noProof/>
             <w:webHidden/>
           </w:rPr>
-          <w:instrText xml:space="preserve"> PAGEREF _Toc242543158 \h </w:instrText>
+          <w:instrText xml:space="preserve"> PAGEREF _Toc242544627 \h </w:instrText>
         </w:r>
         <w:r>
           <w:rPr>
@@ -1981,7 +1981,7 @@
           <w14:ligatures w14:val="standardContextual"/>
         </w:rPr>
       </w:pPr>
-      <w:hyperlink w:anchor="_Toc242543159" w:history="1">
+      <w:hyperlink w:anchor="_Toc242544628" w:history="1">
         <w:r>
           <w:rPr>
             <w:rStyle w:val="Hyperlink"/>
@@ -2008,7 +2008,7 @@
             <w:noProof/>
             <w:webHidden/>
           </w:rPr>
-          <w:instrText xml:space="preserve"> PAGEREF _Toc242543159 \h </w:instrText>
+          <w:instrText xml:space="preserve"> PAGEREF _Toc242544628 \h </w:instrText>
         </w:r>
         <w:r>
           <w:rPr>
@@ -2053,7 +2053,7 @@
           <w14:ligatures w14:val="standardContextual"/>
         </w:rPr>
       </w:pPr>
-      <w:hyperlink w:anchor="_Toc242543160" w:history="1">
+      <w:hyperlink w:anchor="_Toc242544629" w:history="1">
         <w:r>
           <w:rPr>
             <w:rStyle w:val="Hyperlink"/>
@@ -2080,7 +2080,7 @@
             <w:noProof/>
             <w:webHidden/>
           </w:rPr>
-          <w:instrText xml:space="preserve"> PAGEREF _Toc242543160 \h </w:instrText>
+          <w:instrText xml:space="preserve"> PAGEREF _Toc242544629 \h </w:instrText>
         </w:r>
         <w:r>
           <w:rPr>
@@ -2126,7 +2126,7 @@
           <w14:ligatures w14:val="standardContextual"/>
         </w:rPr>
       </w:pPr>
-      <w:hyperlink w:anchor="_Toc242543161" w:history="1">
+      <w:hyperlink w:anchor="_Toc242544630" w:history="1">
         <w:r>
           <w:rPr>
             <w:rStyle w:val="Hyperlink"/>
@@ -2153,7 +2153,7 @@
             <w:noProof/>
             <w:webHidden/>
           </w:rPr>
-          <w:instrText xml:space="preserve"> PAGEREF _Toc242543161 \h </w:instrText>
+          <w:instrText xml:space="preserve"> PAGEREF _Toc242544630 \h </w:instrText>
         </w:r>
         <w:r>
           <w:rPr>
@@ -2198,7 +2198,7 @@
           <w14:ligatures w14:val="standardContextual"/>
         </w:rPr>
       </w:pPr>
-      <w:hyperlink w:anchor="_Toc242543162" w:history="1">
+      <w:hyperlink w:anchor="_Toc242544631" w:history="1">
         <w:r>
           <w:rPr>
             <w:rStyle w:val="Hyperlink"/>
@@ -2225,7 +2225,7 @@
             <w:noProof/>
             <w:webHidden/>
           </w:rPr>
-          <w:instrText xml:space="preserve"> PAGEREF _Toc242543162 \h </w:instrText>
+          <w:instrText xml:space="preserve"> PAGEREF _Toc242544631 \h </w:instrText>
         </w:r>
         <w:r>
           <w:rPr>
@@ -2270,7 +2270,7 @@
           <w14:ligatures w14:val="standardContextual"/>
         </w:rPr>
       </w:pPr>
-      <w:hyperlink w:anchor="_Toc242543163" w:history="1">
+      <w:hyperlink w:anchor="_Toc242544632" w:history="1">
         <w:r>
           <w:rPr>
             <w:rStyle w:val="Hyperlink"/>
@@ -2297,7 +2297,7 @@
             <w:noProof/>
             <w:webHidden/>
           </w:rPr>
-          <w:instrText xml:space="preserve"> PAGEREF _Toc242543163 \h </w:instrText>
+          <w:instrText xml:space="preserve"> PAGEREF _Toc242544632 \h </w:instrText>
         </w:r>
         <w:r>
           <w:rPr>
@@ -2342,7 +2342,7 @@
           <w14:ligatures w14:val="standardContextual"/>
         </w:rPr>
       </w:pPr>
-      <w:hyperlink w:anchor="_Toc242543164" w:history="1">
+      <w:hyperlink w:anchor="_Toc242544633" w:history="1">
         <w:r>
           <w:rPr>
             <w:rStyle w:val="Hyperlink"/>
@@ -2369,7 +2369,7 @@
             <w:noProof/>
             <w:webHidden/>
           </w:rPr>
-          <w:instrText xml:space="preserve"> PAGEREF _Toc242543164 \h </w:instrText>
+          <w:instrText xml:space="preserve"> PAGEREF _Toc242544633 \h </w:instrText>
         </w:r>
         <w:r>
           <w:rPr>
@@ -2414,7 +2414,7 @@
           <w14:ligatures w14:val="standardContextual"/>
         </w:rPr>
       </w:pPr>
-      <w:hyperlink w:anchor="_Toc242543165" w:history="1">
+      <w:hyperlink w:anchor="_Toc242544634" w:history="1">
         <w:r>
           <w:rPr>
             <w:rStyle w:val="Hyperlink"/>
@@ -2441,7 +2441,7 @@
             <w:noProof/>
             <w:webHidden/>
           </w:rPr>
-          <w:instrText xml:space="preserve"> PAGEREF _Toc242543165 \h </w:instrText>
+          <w:instrText xml:space="preserve"> PAGEREF _Toc242544634 \h </w:instrText>
         </w:r>
         <w:r>
           <w:rPr>
@@ -2486,7 +2486,7 @@
           <w14:ligatures w14:val="standardContextual"/>
         </w:rPr>
       </w:pPr>
-      <w:hyperlink w:anchor="_Toc242543166" w:history="1">
+      <w:hyperlink w:anchor="_Toc242544635" w:history="1">
         <w:r>
           <w:rPr>
             <w:rStyle w:val="Hyperlink"/>
@@ -2513,7 +2513,7 @@
             <w:noProof/>
             <w:webHidden/>
           </w:rPr>
-          <w:instrText xml:space="preserve"> PAGEREF _Toc242543166 \h </w:instrText>
+          <w:instrText xml:space="preserve"> PAGEREF _Toc242544635 \h </w:instrText>
         </w:r>
         <w:r>
           <w:rPr>
@@ -2558,7 +2558,7 @@
           <w14:ligatures w14:val="standardContextual"/>
         </w:rPr>
       </w:pPr>
-      <w:hyperlink w:anchor="_Toc242543167" w:history="1">
+      <w:hyperlink w:anchor="_Toc242544636" w:history="1">
         <w:r>
           <w:rPr>
             <w:rStyle w:val="Hyperlink"/>
@@ -2585,7 +2585,7 @@
             <w:noProof/>
             <w:webHidden/>
           </w:rPr>
-          <w:instrText xml:space="preserve"> PAGEREF _Toc242543167 \h </w:instrText>
+          <w:instrText xml:space="preserve"> PAGEREF _Toc242544636 \h </w:instrText>
         </w:r>
         <w:r>
           <w:rPr>
@@ -2630,7 +2630,7 @@
           <w14:ligatures w14:val="standardContextual"/>
         </w:rPr>
       </w:pPr>
-      <w:hyperlink w:anchor="_Toc242543168" w:history="1">
+      <w:hyperlink w:anchor="_Toc242544637" w:history="1">
         <w:r>
           <w:rPr>
             <w:rStyle w:val="Hyperlink"/>
@@ -2657,7 +2657,7 @@
             <w:noProof/>
             <w:webHidden/>
           </w:rPr>
-          <w:instrText xml:space="preserve"> PAGEREF _Toc242543168 \h </w:instrText>
+          <w:instrText xml:space="preserve"> PAGEREF _Toc242544637 \h </w:instrText>
         </w:r>
         <w:r>
           <w:rPr>
@@ -2702,7 +2702,7 @@
           <w14:ligatures w14:val="standardContextual"/>
         </w:rPr>
       </w:pPr>
-      <w:hyperlink w:anchor="_Toc242543169" w:history="1">
+      <w:hyperlink w:anchor="_Toc242544638" w:history="1">
         <w:r>
           <w:rPr>
             <w:rStyle w:val="Hyperlink"/>
@@ -2729,7 +2729,7 @@
             <w:noProof/>
             <w:webHidden/>
           </w:rPr>
-          <w:instrText xml:space="preserve"> PAGEREF _Toc242543169 \h </w:instrText>
+          <w:instrText xml:space="preserve"> PAGEREF _Toc242544638 \h </w:instrText>
         </w:r>
         <w:r>
           <w:rPr>
@@ -2775,7 +2775,7 @@
           <w14:ligatures w14:val="standardContextual"/>
         </w:rPr>
       </w:pPr>
-      <w:hyperlink w:anchor="_Toc242543170" w:history="1">
+      <w:hyperlink w:anchor="_Toc242544639" w:history="1">
         <w:r>
           <w:rPr>
             <w:rStyle w:val="Hyperlink"/>
@@ -2802,7 +2802,7 @@
             <w:noProof/>
             <w:webHidden/>
           </w:rPr>
-          <w:instrText xml:space="preserve"> PAGEREF _Toc242543170 \h </w:instrText>
+          <w:instrText xml:space="preserve"> PAGEREF _Toc242544639 \h </w:instrText>
         </w:r>
         <w:r>
           <w:rPr>
@@ -2847,7 +2847,7 @@
           <w14:ligatures w14:val="standardContextual"/>
         </w:rPr>
       </w:pPr>
-      <w:hyperlink w:anchor="_Toc242543171" w:history="1">
+      <w:hyperlink w:anchor="_Toc242544640" w:history="1">
         <w:r>
           <w:rPr>
             <w:rStyle w:val="Hyperlink"/>
@@ -2874,7 +2874,7 @@
             <w:noProof/>
             <w:webHidden/>
           </w:rPr>
-          <w:instrText xml:space="preserve"> PAGEREF _Toc242543171 \h </w:instrText>
+          <w:instrText xml:space="preserve"> PAGEREF _Toc242544640 \h </w:instrText>
         </w:r>
         <w:r>
           <w:rPr>
@@ -2919,7 +2919,7 @@
           <w14:ligatures w14:val="standardContextual"/>
         </w:rPr>
       </w:pPr>
-      <w:hyperlink w:anchor="_Toc242543172" w:history="1">
+      <w:hyperlink w:anchor="_Toc242544641" w:history="1">
         <w:r>
           <w:rPr>
             <w:rStyle w:val="Hyperlink"/>
@@ -2946,7 +2946,7 @@
             <w:noProof/>
             <w:webHidden/>
           </w:rPr>
-          <w:instrText xml:space="preserve"> PAGEREF _Toc242543172 \h </w:instrText>
+          <w:instrText xml:space="preserve"> PAGEREF _Toc242544641 \h </w:instrText>
         </w:r>
         <w:r>
           <w:rPr>
@@ -2991,7 +2991,7 @@
           <w14:ligatures w14:val="standardContextual"/>
         </w:rPr>
       </w:pPr>
-      <w:hyperlink w:anchor="_Toc242543173" w:history="1">
+      <w:hyperlink w:anchor="_Toc242544642" w:history="1">
         <w:r>
           <w:rPr>
             <w:rStyle w:val="Hyperlink"/>
@@ -3018,7 +3018,7 @@
             <w:noProof/>
             <w:webHidden/>
           </w:rPr>
-          <w:instrText xml:space="preserve"> PAGEREF _Toc242543173 \h </w:instrText>
+          <w:instrText xml:space="preserve"> PAGEREF _Toc242544642 \h </w:instrText>
         </w:r>
         <w:r>
           <w:rPr>
@@ -3063,7 +3063,7 @@
           <w14:ligatures w14:val="standardContextual"/>
         </w:rPr>
       </w:pPr>
-      <w:hyperlink w:anchor="_Toc242543174" w:history="1">
+      <w:hyperlink w:anchor="_Toc242544643" w:history="1">
         <w:r>
           <w:rPr>
             <w:rStyle w:val="Hyperlink"/>
@@ -3090,7 +3090,7 @@
             <w:noProof/>
             <w:webHidden/>
           </w:rPr>
-          <w:instrText xml:space="preserve"> PAGEREF _Toc242543174 \h </w:instrText>
+          <w:instrText xml:space="preserve"> PAGEREF _Toc242544643 \h </w:instrText>
         </w:r>
         <w:r>
           <w:rPr>
@@ -3135,7 +3135,7 @@
           <w14:ligatures w14:val="standardContextual"/>
         </w:rPr>
       </w:pPr>
-      <w:hyperlink w:anchor="_Toc242543175" w:history="1">
+      <w:hyperlink w:anchor="_Toc242544644" w:history="1">
         <w:r>
           <w:rPr>
             <w:rStyle w:val="Hyperlink"/>
@@ -3162,7 +3162,7 @@
             <w:noProof/>
             <w:webHidden/>
           </w:rPr>
-          <w:instrText xml:space="preserve"> PAGEREF _Toc242543175 \h </w:instrText>
+          <w:instrText xml:space="preserve"> PAGEREF _Toc242544644 \h </w:instrText>
         </w:r>
         <w:r>
           <w:rPr>
@@ -3207,7 +3207,7 @@
           <w14:ligatures w14:val="standardContextual"/>
         </w:rPr>
       </w:pPr>
-      <w:hyperlink w:anchor="_Toc242543176" w:history="1">
+      <w:hyperlink w:anchor="_Toc242544645" w:history="1">
         <w:r>
           <w:rPr>
             <w:rStyle w:val="Hyperlink"/>
@@ -3234,7 +3234,7 @@
             <w:noProof/>
             <w:webHidden/>
           </w:rPr>
-          <w:instrText xml:space="preserve"> PAGEREF _Toc242543176 \h </w:instrText>
+          <w:instrText xml:space="preserve"> PAGEREF _Toc242544645 \h </w:instrText>
         </w:r>
         <w:r>
           <w:rPr>
@@ -3279,7 +3279,7 @@
           <w14:ligatures w14:val="standardContextual"/>
         </w:rPr>
       </w:pPr>
-      <w:hyperlink w:anchor="_Toc242543177" w:history="1">
+      <w:hyperlink w:anchor="_Toc242544646" w:history="1">
         <w:r>
           <w:rPr>
             <w:rStyle w:val="Hyperlink"/>
@@ -3306,7 +3306,7 @@
             <w:noProof/>
             <w:webHidden/>
           </w:rPr>
-          <w:instrText xml:space="preserve"> PAGEREF _Toc242543177 \h </w:instrText>
+          <w:instrText xml:space="preserve"> PAGEREF _Toc242544646 \h </w:instrText>
         </w:r>
         <w:r>
           <w:rPr>
@@ -3352,7 +3352,7 @@
           <w14:ligatures w14:val="standardContextual"/>
         </w:rPr>
       </w:pPr>
-      <w:hyperlink w:anchor="_Toc242543178" w:history="1">
+      <w:hyperlink w:anchor="_Toc242544647" w:history="1">
         <w:r>
           <w:rPr>
             <w:rStyle w:val="Hyperlink"/>
@@ -3379,7 +3379,7 @@
             <w:noProof/>
             <w:webHidden/>
           </w:rPr>
-          <w:instrText xml:space="preserve"> PAGEREF _Toc242543178 \h </w:instrText>
+          <w:instrText xml:space="preserve"> PAGEREF _Toc242544647 \h </w:instrText>
         </w:r>
         <w:r>
           <w:rPr>
@@ -3424,7 +3424,7 @@
           <w14:ligatures w14:val="standardContextual"/>
         </w:rPr>
       </w:pPr>
-      <w:hyperlink w:anchor="_Toc242543179" w:history="1">
+      <w:hyperlink w:anchor="_Toc242544648" w:history="1">
         <w:r>
           <w:rPr>
             <w:rStyle w:val="Hyperlink"/>
@@ -3451,7 +3451,7 @@
             <w:noProof/>
             <w:webHidden/>
           </w:rPr>
-          <w:instrText xml:space="preserve"> PAGEREF _Toc242543179 \h </w:instrText>
+          <w:instrText xml:space="preserve"> PAGEREF _Toc242544648 \h </w:instrText>
         </w:r>
         <w:r>
           <w:rPr>
@@ -3496,7 +3496,7 @@
           <w14:ligatures w14:val="standardContextual"/>
         </w:rPr>
       </w:pPr>
-      <w:hyperlink w:anchor="_Toc242543180" w:history="1">
+      <w:hyperlink w:anchor="_Toc242544649" w:history="1">
         <w:r>
           <w:rPr>
             <w:rStyle w:val="Hyperlink"/>
@@ -3523,7 +3523,7 @@
             <w:noProof/>
             <w:webHidden/>
           </w:rPr>
-          <w:instrText xml:space="preserve"> PAGEREF _Toc242543180 \h </w:instrText>
+          <w:instrText xml:space="preserve"> PAGEREF _Toc242544649 \h </w:instrText>
         </w:r>
         <w:r>
           <w:rPr>
@@ -3568,7 +3568,7 @@
           <w14:ligatures w14:val="standardContextual"/>
         </w:rPr>
       </w:pPr>
-      <w:hyperlink w:anchor="_Toc242543181" w:history="1">
+      <w:hyperlink w:anchor="_Toc242544650" w:history="1">
         <w:r>
           <w:rPr>
             <w:rStyle w:val="Hyperlink"/>
@@ -3595,7 +3595,7 @@
             <w:noProof/>
             <w:webHidden/>
           </w:rPr>
-          <w:instrText xml:space="preserve"> PAGEREF _Toc242543181 \h </w:instrText>
+          <w:instrText xml:space="preserve"> PAGEREF _Toc242544650 \h </w:instrText>
         </w:r>
         <w:r>
           <w:rPr>
@@ -3640,7 +3640,7 @@
           <w14:ligatures w14:val="standardContextual"/>
         </w:rPr>
       </w:pPr>
-      <w:hyperlink w:anchor="_Toc242543182" w:history="1">
+      <w:hyperlink w:anchor="_Toc242544651" w:history="1">
         <w:r>
           <w:rPr>
             <w:rStyle w:val="Hyperlink"/>
@@ -3667,7 +3667,7 @@
             <w:noProof/>
             <w:webHidden/>
           </w:rPr>
-          <w:instrText xml:space="preserve"> PAGEREF _Toc242543182 \h </w:instrText>
+          <w:instrText xml:space="preserve"> PAGEREF _Toc242544651 \h </w:instrText>
         </w:r>
         <w:r>
           <w:rPr>
@@ -3712,7 +3712,7 @@
           <w14:ligatures w14:val="standardContextual"/>
         </w:rPr>
       </w:pPr>
-      <w:hyperlink w:anchor="_Toc242543183" w:history="1">
+      <w:hyperlink w:anchor="_Toc242544652" w:history="1">
         <w:r>
           <w:rPr>
             <w:rStyle w:val="Hyperlink"/>
@@ -3739,7 +3739,7 @@
             <w:noProof/>
             <w:webHidden/>
           </w:rPr>
-          <w:instrText xml:space="preserve"> PAGEREF _Toc242543183 \h </w:instrText>
+          <w:instrText xml:space="preserve"> PAGEREF _Toc242544652 \h </w:instrText>
         </w:r>
         <w:r>
           <w:rPr>
@@ -3784,7 +3784,7 @@
           <w14:ligatures w14:val="standardContextual"/>
         </w:rPr>
       </w:pPr>
-      <w:hyperlink w:anchor="_Toc242543184" w:history="1">
+      <w:hyperlink w:anchor="_Toc242544653" w:history="1">
         <w:r>
           <w:rPr>
             <w:rStyle w:val="Hyperlink"/>
@@ -3811,7 +3811,7 @@
             <w:noProof/>
             <w:webHidden/>
           </w:rPr>
-          <w:instrText xml:space="preserve"> PAGEREF _Toc242543184 \h </w:instrText>
+          <w:instrText xml:space="preserve"> PAGEREF _Toc242544653 \h </w:instrText>
         </w:r>
         <w:r>
           <w:rPr>
@@ -3856,7 +3856,7 @@
           <w14:ligatures w14:val="standardContextual"/>
         </w:rPr>
       </w:pPr>
-      <w:hyperlink w:anchor="_Toc242543185" w:history="1">
+      <w:hyperlink w:anchor="_Toc242544654" w:history="1">
         <w:r>
           <w:rPr>
             <w:rStyle w:val="Hyperlink"/>
@@ -3883,7 +3883,7 @@
             <w:noProof/>
             <w:webHidden/>
           </w:rPr>
-          <w:instrText xml:space="preserve"> PAGEREF _Toc242543185 \h </w:instrText>
+          <w:instrText xml:space="preserve"> PAGEREF _Toc242544654 \h </w:instrText>
         </w:r>
         <w:r>
           <w:rPr>
@@ -3928,7 +3928,7 @@
           <w14:ligatures w14:val="standardContextual"/>
         </w:rPr>
       </w:pPr>
-      <w:hyperlink w:anchor="_Toc242543186" w:history="1">
+      <w:hyperlink w:anchor="_Toc242544655" w:history="1">
         <w:r>
           <w:rPr>
             <w:rStyle w:val="Hyperlink"/>
@@ -3955,7 +3955,7 @@
             <w:noProof/>
             <w:webHidden/>
           </w:rPr>
-          <w:instrText xml:space="preserve"> PAGEREF _Toc242543186 \h </w:instrText>
+          <w:instrText xml:space="preserve"> PAGEREF _Toc242544655 \h </w:instrText>
         </w:r>
         <w:r>
           <w:rPr>
@@ -4000,7 +4000,7 @@
           <w14:ligatures w14:val="standardContextual"/>
         </w:rPr>
       </w:pPr>
-      <w:hyperlink w:anchor="_Toc242543187" w:history="1">
+      <w:hyperlink w:anchor="_Toc242544656" w:history="1">
         <w:r>
           <w:rPr>
             <w:rStyle w:val="Hyperlink"/>
@@ -4027,7 +4027,7 @@
             <w:noProof/>
             <w:webHidden/>
           </w:rPr>
-          <w:instrText xml:space="preserve"> PAGEREF _Toc242543187 \h </w:instrText>
+          <w:instrText xml:space="preserve"> PAGEREF _Toc242544656 \h </w:instrText>
         </w:r>
         <w:r>
           <w:rPr>
@@ -4073,7 +4073,7 @@
           <w14:ligatures w14:val="standardContextual"/>
         </w:rPr>
       </w:pPr>
-      <w:hyperlink w:anchor="_Toc242543188" w:history="1">
+      <w:hyperlink w:anchor="_Toc242544657" w:history="1">
         <w:r>
           <w:rPr>
             <w:rStyle w:val="Hyperlink"/>
@@ -4100,7 +4100,7 @@
             <w:noProof/>
             <w:webHidden/>
           </w:rPr>
-          <w:instrText xml:space="preserve"> PAGEREF _Toc242543188 \h </w:instrText>
+          <w:instrText xml:space="preserve"> PAGEREF _Toc242544657 \h </w:instrText>
         </w:r>
         <w:r>
           <w:rPr>
@@ -4166,7 +4166,7 @@
       <w:pPr>
         <w:pStyle w:val="Heading1"/>
       </w:pPr>
-      <w:bookmarkStart w:id="0" w:name="_Toc242543142"/>
+      <w:bookmarkStart w:id="0" w:name="_Toc242544611"/>
       <w:r>
         <w:t>1. Group information and project title</w:t>
       </w:r>
@@ -4176,7 +4176,7 @@
       <w:pPr>
         <w:pStyle w:val="Heading2"/>
       </w:pPr>
-      <w:bookmarkStart w:id="1" w:name="_Toc242543143"/>
+      <w:bookmarkStart w:id="1" w:name="_Toc242544612"/>
       <w:r>
         <w:t>1.1 Group 85</w:t>
       </w:r>
@@ -4191,7 +4191,7 @@
       <w:pPr>
         <w:pStyle w:val="Heading2"/>
       </w:pPr>
-      <w:bookmarkStart w:id="2" w:name="_Toc242543144"/>
+      <w:bookmarkStart w:id="2" w:name="_Toc242544613"/>
       <w:r>
         <w:t>1.2 Project title</w:t>
       </w:r>
@@ -4214,7 +4214,7 @@
       <w:pPr>
         <w:pStyle w:val="Heading1"/>
       </w:pPr>
-      <w:bookmarkStart w:id="3" w:name="_Toc242543145"/>
+      <w:bookmarkStart w:id="3" w:name="_Toc242544614"/>
       <w:r>
         <w:t>2. Problem description and motivation</w:t>
       </w:r>
@@ -4224,7 +4224,7 @@
       <w:pPr>
         <w:pStyle w:val="Heading2"/>
       </w:pPr>
-      <w:bookmarkStart w:id="4" w:name="_Toc242543146"/>
+      <w:bookmarkStart w:id="4" w:name="_Toc242544615"/>
       <w:r>
         <w:t>2.1 The problem</w:t>
       </w:r>
@@ -4245,7 +4245,7 @@
     </w:p>
     <w:p>
       <w:r>
-        <w:t>We set the task up as supervised multi-class classification, the first type of learning covered in Week 1. For every square about five kilometres across, and for every year, the model predicts one of three labels:</w:t>
+        <w:t>We set the task up as supervised multi-class classification, the first type of learning covered in Week 1 of the unit (Karim, 2026). For every square about five kilometres across, and for every year, the model predicts one of three labels:</w:t>
       </w:r>
     </w:p>
     <w:p>
@@ -4284,7 +4284,7 @@
       <w:pPr>
         <w:pStyle w:val="Heading2"/>
       </w:pPr>
-      <w:bookmarkStart w:id="5" w:name="_Toc242543147"/>
+      <w:bookmarkStart w:id="5" w:name="_Toc242544616"/>
       <w:r>
         <w:t>2.2 Why we chose it</w:t>
       </w:r>
@@ -4302,7 +4302,7 @@
       <w:pPr>
         <w:pStyle w:val="Heading1"/>
       </w:pPr>
-      <w:bookmarkStart w:id="6" w:name="_Toc242543148"/>
+      <w:bookmarkStart w:id="6" w:name="_Toc242544617"/>
       <w:r>
         <w:t>3. Dataset description</w:t>
       </w:r>
@@ -4312,7 +4312,7 @@
       <w:pPr>
         <w:pStyle w:val="Heading2"/>
       </w:pPr>
-      <w:bookmarkStart w:id="7" w:name="_Toc242543149"/>
+      <w:bookmarkStart w:id="7" w:name="_Toc242544618"/>
       <w:r>
         <w:t>3.1 Three sources on one grid</w:t>
       </w:r>
@@ -4799,7 +4799,7 @@
       <w:pPr>
         <w:pStyle w:val="Heading2"/>
       </w:pPr>
-      <w:bookmarkStart w:id="8" w:name="_Toc242543150"/>
+      <w:bookmarkStart w:id="8" w:name="_Toc242544619"/>
       <w:r>
         <w:t>3.2 Rows, columns and classes</w:t>
       </w:r>
@@ -5599,7 +5599,7 @@
       <w:pPr>
         <w:pStyle w:val="Heading2"/>
       </w:pPr>
-      <w:bookmarkStart w:id="9" w:name="_Toc242543151"/>
+      <w:bookmarkStart w:id="9" w:name="_Toc242544620"/>
       <w:r>
         <w:t>3.3 When the Territory burns</w:t>
       </w:r>
@@ -5672,7 +5672,7 @@
       <w:pPr>
         <w:pStyle w:val="Heading2"/>
       </w:pPr>
-      <w:bookmarkStart w:id="10" w:name="_Toc242543152"/>
+      <w:bookmarkStart w:id="10" w:name="_Toc242544621"/>
       <w:r>
         <w:t>3.4 Fire and rain, year by year</w:t>
       </w:r>
@@ -5767,7 +5767,7 @@
       <w:pPr>
         <w:pStyle w:val="Heading1"/>
       </w:pPr>
-      <w:bookmarkStart w:id="11" w:name="_Toc242543153"/>
+      <w:bookmarkStart w:id="11" w:name="_Toc242544622"/>
       <w:r>
         <w:t>4. Dataset analysis, feature selection, transformation, preprocessing and engineering</w:t>
       </w:r>
@@ -5775,14 +5775,14 @@
     </w:p>
     <w:p>
       <w:r>
-        <w:t>Section 3 described the target. This section analyses the inputs, following the order of the Week 6 practical: single features, then pairs, then several at once. Below each chart is what we learned from it that the raw table did not show.</w:t>
+        <w:t>Section 3 described the target. This section analyses the inputs, following the order of the Week 6 practical (Karim, 2026): single features, then pairs, then several at once. Below each chart is what we learned from it that the raw table did not show.</w:t>
       </w:r>
     </w:p>
     <w:p>
       <w:pPr>
         <w:pStyle w:val="Heading2"/>
       </w:pPr>
-      <w:bookmarkStart w:id="12" w:name="_Toc242543154"/>
+      <w:bookmarkStart w:id="12" w:name="_Toc242544623"/>
       <w:r>
         <w:t>4.1 Where it burns</w:t>
       </w:r>
@@ -5910,7 +5910,7 @@
       <w:pPr>
         <w:pStyle w:val="Heading2"/>
       </w:pPr>
-      <w:bookmarkStart w:id="13" w:name="_Toc242543155"/>
+      <w:bookmarkStart w:id="13" w:name="_Toc242544624"/>
       <w:r>
         <w:t>4.2 Fire history and the wet season together</w:t>
       </w:r>
@@ -5991,7 +5991,7 @@
       <w:pPr>
         <w:pStyle w:val="Heading2"/>
       </w:pPr>
-      <w:bookmarkStart w:id="14" w:name="_Toc242543156"/>
+      <w:bookmarkStart w:id="14" w:name="_Toc242544625"/>
       <w:r>
         <w:t>4.3 The shape of the inputs and how we transformed them</w:t>
       </w:r>
@@ -6074,7 +6074,7 @@
       <w:pPr>
         <w:pStyle w:val="Heading2"/>
       </w:pPr>
-      <w:bookmarkStart w:id="15" w:name="_Toc242543157"/>
+      <w:bookmarkStart w:id="15" w:name="_Toc242544626"/>
       <w:r>
         <w:t>4.4 How the inputs relate to each other</w:t>
       </w:r>
@@ -6152,7 +6152,7 @@
       <w:pPr>
         <w:pStyle w:val="Heading2"/>
       </w:pPr>
-      <w:bookmarkStart w:id="16" w:name="_Toc242543158"/>
+      <w:bookmarkStart w:id="16" w:name="_Toc242544627"/>
       <w:r>
         <w:t>4.5 Fire regions found by k-means clustering</w:t>
       </w:r>
@@ -6233,7 +6233,7 @@
       <w:pPr>
         <w:pStyle w:val="Heading2"/>
       </w:pPr>
-      <w:bookmarkStart w:id="17" w:name="_Toc242543159"/>
+      <w:bookmarkStart w:id="17" w:name="_Toc242544628"/>
       <w:r>
         <w:t>4.6 Preprocessing: from pixels to labels</w:t>
       </w:r>
@@ -6316,7 +6316,7 @@
       <w:pPr>
         <w:pStyle w:val="Heading2"/>
       </w:pPr>
-      <w:bookmarkStart w:id="18" w:name="_Toc242543160"/>
+      <w:bookmarkStart w:id="18" w:name="_Toc242544629"/>
       <w:r>
         <w:t>4.7 Feature engineering and selection</w:t>
       </w:r>
@@ -6793,7 +6793,7 @@
       <w:pPr>
         <w:pStyle w:val="Heading1"/>
       </w:pPr>
-      <w:bookmarkStart w:id="19" w:name="_Toc242543161"/>
+      <w:bookmarkStart w:id="19" w:name="_Toc242544630"/>
       <w:r>
         <w:t>5. Choice and description of the algorithms</w:t>
       </w:r>
@@ -6803,7 +6803,7 @@
       <w:pPr>
         <w:pStyle w:val="Heading2"/>
       </w:pPr>
-      <w:bookmarkStart w:id="20" w:name="_Toc242543162"/>
+      <w:bookmarkStart w:id="20" w:name="_Toc242544631"/>
       <w:r>
         <w:t>5.1 Why these six</w:t>
       </w:r>
@@ -6826,7 +6826,7 @@
       <w:pPr>
         <w:pStyle w:val="Heading2"/>
       </w:pPr>
-      <w:bookmarkStart w:id="21" w:name="_Toc242543163"/>
+      <w:bookmarkStart w:id="21" w:name="_Toc242544632"/>
       <w:r>
         <w:t>5.2 Decision tree</w:t>
       </w:r>
@@ -6844,7 +6844,7 @@
       <w:pPr>
         <w:pStyle w:val="Heading2"/>
       </w:pPr>
-      <w:bookmarkStart w:id="22" w:name="_Toc242543164"/>
+      <w:bookmarkStart w:id="22" w:name="_Toc242544633"/>
       <w:r>
         <w:t>5.3 Random forest</w:t>
       </w:r>
@@ -6859,7 +6859,7 @@
       <w:pPr>
         <w:pStyle w:val="Heading2"/>
       </w:pPr>
-      <w:bookmarkStart w:id="23" w:name="_Toc242543165"/>
+      <w:bookmarkStart w:id="23" w:name="_Toc242544634"/>
       <w:r>
         <w:t>5.4 Naive Bayes</w:t>
       </w:r>
@@ -6877,7 +6877,7 @@
       <w:pPr>
         <w:pStyle w:val="Heading2"/>
       </w:pPr>
-      <w:bookmarkStart w:id="24" w:name="_Toc242543166"/>
+      <w:bookmarkStart w:id="24" w:name="_Toc242544635"/>
       <w:r>
         <w:t>5.5 Gradient boosting</w:t>
       </w:r>
@@ -6895,7 +6895,7 @@
       <w:pPr>
         <w:pStyle w:val="Heading2"/>
       </w:pPr>
-      <w:bookmarkStart w:id="25" w:name="_Toc242543167"/>
+      <w:bookmarkStart w:id="25" w:name="_Toc242544636"/>
       <w:r>
         <w:t>5.6 Multilayer ANN</w:t>
       </w:r>
@@ -6913,7 +6913,7 @@
       <w:pPr>
         <w:pStyle w:val="Heading2"/>
       </w:pPr>
-      <w:bookmarkStart w:id="26" w:name="_Toc242543168"/>
+      <w:bookmarkStart w:id="26" w:name="_Toc242544637"/>
       <w:r>
         <w:t>5.7 LSTM</w:t>
       </w:r>
@@ -6931,7 +6931,7 @@
       <w:pPr>
         <w:pStyle w:val="Heading2"/>
       </w:pPr>
-      <w:bookmarkStart w:id="27" w:name="_Toc242543169"/>
+      <w:bookmarkStart w:id="27" w:name="_Toc242544638"/>
       <w:r>
         <w:t>5.8 Key steps</w:t>
       </w:r>
@@ -8161,7 +8161,7 @@
       <w:pPr>
         <w:pStyle w:val="Heading1"/>
       </w:pPr>
-      <w:bookmarkStart w:id="28" w:name="_Toc242543170"/>
+      <w:bookmarkStart w:id="28" w:name="_Toc242544639"/>
       <w:r>
         <w:t>6. Overview of model evaluation measures</w:t>
       </w:r>
@@ -8171,7 +8171,7 @@
       <w:pPr>
         <w:pStyle w:val="Heading2"/>
       </w:pPr>
-      <w:bookmarkStart w:id="29" w:name="_Toc242543171"/>
+      <w:bookmarkStart w:id="29" w:name="_Toc242544640"/>
       <w:r>
         <w:t>6.1 The confusion matrix</w:t>
       </w:r>
@@ -8179,7 +8179,7 @@
     </w:p>
     <w:p>
       <w:r>
-        <w:t>Every measure we report comes from the confusion matrix (Week 5), whose rows are what happened and whose columns are what the model predicted. For one class, say late fire, a true positive (TP) is a late fire called late. A false positive (FP) is a square called late that did not burn late, a false alarm. A false negative (FN) is a late fire called something else, a missed fire. A true negative (TN) is everything else. With three classes, each class takes its turn as the positive one.</w:t>
+        <w:t>Every measure we report comes from the confusion matrix (Karim, 2026, Week 5), whose rows are what happened and whose columns are what the model predicted. For one class, say late fire, a true positive (TP) is a late fire called late. A false positive (FP) is a square called late that did not burn late, a false alarm. A false negative (FN) is a late fire called something else, a missed fire. A true negative (TN) is everything else. With three classes, each class takes its turn as the positive one.</w:t>
       </w:r>
     </w:p>
     <w:p>
@@ -8241,7 +8241,7 @@
       <w:pPr>
         <w:pStyle w:val="Heading2"/>
       </w:pPr>
-      <w:bookmarkStart w:id="30" w:name="_Toc242543172"/>
+      <w:bookmarkStart w:id="30" w:name="_Toc242544641"/>
       <w:r>
         <w:t>6.2 Accuracy</w:t>
       </w:r>
@@ -8256,7 +8256,7 @@
       <w:pPr>
         <w:pStyle w:val="Heading2"/>
       </w:pPr>
-      <w:bookmarkStart w:id="31" w:name="_Toc242543173"/>
+      <w:bookmarkStart w:id="31" w:name="_Toc242544642"/>
       <w:r>
         <w:t>6.3 Precision</w:t>
       </w:r>
@@ -8271,7 +8271,7 @@
       <w:pPr>
         <w:pStyle w:val="Heading2"/>
       </w:pPr>
-      <w:bookmarkStart w:id="32" w:name="_Toc242543174"/>
+      <w:bookmarkStart w:id="32" w:name="_Toc242544643"/>
       <w:r>
         <w:t>6.4 Recall</w:t>
       </w:r>
@@ -8286,7 +8286,7 @@
       <w:pPr>
         <w:pStyle w:val="Heading2"/>
       </w:pPr>
-      <w:bookmarkStart w:id="33" w:name="_Toc242543175"/>
+      <w:bookmarkStart w:id="33" w:name="_Toc242544644"/>
       <w:r>
         <w:t>6.5 F1 score and macro averaging</w:t>
       </w:r>
@@ -8301,7 +8301,7 @@
       <w:pPr>
         <w:pStyle w:val="Heading2"/>
       </w:pPr>
-      <w:bookmarkStart w:id="34" w:name="_Toc242543176"/>
+      <w:bookmarkStart w:id="34" w:name="_Toc242544645"/>
       <w:r>
         <w:t>6.6 Scoring the probabilities</w:t>
       </w:r>
@@ -8316,7 +8316,7 @@
       <w:pPr>
         <w:pStyle w:val="Heading2"/>
       </w:pPr>
-      <w:bookmarkStart w:id="35" w:name="_Toc242543177"/>
+      <w:bookmarkStart w:id="35" w:name="_Toc242544646"/>
       <w:r>
         <w:t>6.7 Overfitting checks</w:t>
       </w:r>
@@ -8353,7 +8353,7 @@
       <w:pPr>
         <w:pStyle w:val="Heading1"/>
       </w:pPr>
-      <w:bookmarkStart w:id="36" w:name="_Toc242543178"/>
+      <w:bookmarkStart w:id="36" w:name="_Toc242544647"/>
       <w:r>
         <w:t>7. Results and our overall understanding</w:t>
       </w:r>
@@ -8363,7 +8363,7 @@
       <w:pPr>
         <w:pStyle w:val="Heading2"/>
       </w:pPr>
-      <w:bookmarkStart w:id="37" w:name="_Toc242543179"/>
+      <w:bookmarkStart w:id="37" w:name="_Toc242544648"/>
       <w:r>
         <w:t>7.1 How the six models compare</w:t>
       </w:r>
@@ -9929,7 +9929,7 @@
       <w:pPr>
         <w:pStyle w:val="Heading2"/>
       </w:pPr>
-      <w:bookmarkStart w:id="38" w:name="_Toc242543180"/>
+      <w:bookmarkStart w:id="38" w:name="_Toc242544649"/>
       <w:r>
         <w:t>7.2 Precision and recall class by class</w:t>
       </w:r>
@@ -10062,7 +10062,7 @@
       <w:pPr>
         <w:pStyle w:val="Heading2"/>
       </w:pPr>
-      <w:bookmarkStart w:id="39" w:name="_Toc242543181"/>
+      <w:bookmarkStart w:id="39" w:name="_Toc242544650"/>
       <w:r>
         <w:t>7.3 What class weighting did</w:t>
       </w:r>
@@ -10080,7 +10080,7 @@
       <w:pPr>
         <w:pStyle w:val="Heading2"/>
       </w:pPr>
-      <w:bookmarkStart w:id="40" w:name="_Toc242543182"/>
+      <w:bookmarkStart w:id="40" w:name="_Toc242544651"/>
       <w:r>
         <w:t>7.4 Overfitting</w:t>
       </w:r>
@@ -10153,7 +10153,7 @@
       <w:pPr>
         <w:pStyle w:val="Heading2"/>
       </w:pPr>
-      <w:bookmarkStart w:id="41" w:name="_Toc242543183"/>
+      <w:bookmarkStart w:id="41" w:name="_Toc242544652"/>
       <w:r>
         <w:t>7.5 Testing it sixty-six times</w:t>
       </w:r>
@@ -10231,7 +10231,7 @@
       <w:pPr>
         <w:pStyle w:val="Heading2"/>
       </w:pPr>
-      <w:bookmarkStart w:id="42" w:name="_Toc242543184"/>
+      <w:bookmarkStart w:id="42" w:name="_Toc242544653"/>
       <w:r>
         <w:t>7.6 What the model relies on</w:t>
       </w:r>
@@ -10309,7 +10309,7 @@
       <w:pPr>
         <w:pStyle w:val="Heading2"/>
       </w:pPr>
-      <w:bookmarkStart w:id="43" w:name="_Toc242543185"/>
+      <w:bookmarkStart w:id="43" w:name="_Toc242544654"/>
       <w:r>
         <w:t>7.7 The 2026 forecast</w:t>
       </w:r>
@@ -10382,7 +10382,7 @@
       <w:pPr>
         <w:pStyle w:val="Heading2"/>
       </w:pPr>
-      <w:bookmarkStart w:id="44" w:name="_Toc242543186"/>
+      <w:bookmarkStart w:id="44" w:name="_Toc242544655"/>
       <w:r>
         <w:t>7.8 Our overall understanding</w:t>
       </w:r>
@@ -10418,7 +10418,7 @@
       <w:pPr>
         <w:pStyle w:val="Heading2"/>
       </w:pPr>
-      <w:bookmarkStart w:id="45" w:name="_Toc242543187"/>
+      <w:bookmarkStart w:id="45" w:name="_Toc242544656"/>
       <w:r>
         <w:t>7.9 Limitations</w:t>
       </w:r>
@@ -10437,7 +10437,7 @@
         <w:pStyle w:val="Heading1"/>
         <w:pageBreakBefore/>
       </w:pPr>
-      <w:bookmarkStart w:id="46" w:name="_Toc242543188"/>
+      <w:bookmarkStart w:id="46" w:name="_Toc242544657"/>
       <w:r>
         <w:t>References</w:t>
       </w:r>
@@ -11280,31 +11280,31 @@
       </w:rPr>
     </w:lvl>
   </w:abstractNum>
-  <w:num w:numId="1" w16cid:durableId="369691387">
+  <w:num w:numId="1" w16cid:durableId="916398385">
     <w:abstractNumId w:val="8"/>
   </w:num>
-  <w:num w:numId="2" w16cid:durableId="157892958">
+  <w:num w:numId="2" w16cid:durableId="1818645104">
     <w:abstractNumId w:val="6"/>
   </w:num>
-  <w:num w:numId="3" w16cid:durableId="1928347649">
+  <w:num w:numId="3" w16cid:durableId="1959558917">
     <w:abstractNumId w:val="5"/>
   </w:num>
-  <w:num w:numId="4" w16cid:durableId="810709040">
+  <w:num w:numId="4" w16cid:durableId="1955625062">
     <w:abstractNumId w:val="4"/>
   </w:num>
-  <w:num w:numId="5" w16cid:durableId="468939868">
+  <w:num w:numId="5" w16cid:durableId="88815897">
     <w:abstractNumId w:val="7"/>
   </w:num>
-  <w:num w:numId="6" w16cid:durableId="1669745022">
+  <w:num w:numId="6" w16cid:durableId="13654605">
     <w:abstractNumId w:val="3"/>
   </w:num>
-  <w:num w:numId="7" w16cid:durableId="546054">
+  <w:num w:numId="7" w16cid:durableId="337122661">
     <w:abstractNumId w:val="2"/>
   </w:num>
-  <w:num w:numId="8" w16cid:durableId="692264548">
+  <w:num w:numId="8" w16cid:durableId="1181358176">
     <w:abstractNumId w:val="1"/>
   </w:num>
-  <w:num w:numId="9" w16cid:durableId="1892882460">
+  <w:num w:numId="9" w16cid:durableId="730345437">
     <w:abstractNumId w:val="0"/>
   </w:num>
 </w:numbering>
@@ -22719,7 +22719,7 @@
     <w:basedOn w:val="DefaultParagraphFont"/>
     <w:uiPriority w:val="99"/>
     <w:unhideWhenUsed/>
-    <w:rsid w:val="00F81A7B"/>
+    <w:rsid w:val="001C7E30"/>
     <w:rPr>
       <w:color w:val="0000FF" w:themeColor="hyperlink"/>
       <w:u w:val="single"/>

</xml_diff>

<commit_message>
state the split as agreed, without claiming a meeting
</commit_message>
<xml_diff>
--- a/reports/a4/PRT565 A4 Report Group85.docx
+++ b/reports/a4/PRT565 A4 Report Group85.docx
@@ -409,7 +409,7 @@
     </w:p>
     <w:p>
       <w:r>
-        <w:t>The work was divided by mutual agreement at a group meeting. Harsh Rastogi, as project lead, took half the report. Saira Zafar and Tharushi Wimalachandra took a quarter each. Each member wrote their own part, and all three reviewed the others' parts before submission. The word counts cover body text only. Headings, captions, tables, code, the cover, this page and the references are not included.</w:t>
+        <w:t>The work was divided by mutual agreement. Harsh Rastogi, as project lead, took half the report. Saira Zafar and Tharushi Wimalachandra took a quarter each. Each member wrote their own part, and all three reviewed the others' parts before submission. The word counts cover body text only. Headings, captions, tables, code, the cover, this page and the references are not included.</w:t>
       </w:r>
     </w:p>
     <w:tbl>
@@ -754,7 +754,7 @@
       <w:r>
         <w:fldChar w:fldCharType="separate"/>
       </w:r>
-      <w:hyperlink w:anchor="_Toc242544611" w:history="1">
+      <w:hyperlink w:anchor="_Toc242544762" w:history="1">
         <w:r>
           <w:rPr>
             <w:rStyle w:val="Hyperlink"/>
@@ -781,7 +781,7 @@
             <w:noProof/>
             <w:webHidden/>
           </w:rPr>
-          <w:instrText xml:space="preserve"> PAGEREF _Toc242544611 \h </w:instrText>
+          <w:instrText xml:space="preserve"> PAGEREF _Toc242544762 \h </w:instrText>
         </w:r>
         <w:r>
           <w:rPr>
@@ -826,7 +826,7 @@
           <w14:ligatures w14:val="standardContextual"/>
         </w:rPr>
       </w:pPr>
-      <w:hyperlink w:anchor="_Toc242544612" w:history="1">
+      <w:hyperlink w:anchor="_Toc242544763" w:history="1">
         <w:r>
           <w:rPr>
             <w:rStyle w:val="Hyperlink"/>
@@ -853,7 +853,7 @@
             <w:noProof/>
             <w:webHidden/>
           </w:rPr>
-          <w:instrText xml:space="preserve"> PAGEREF _Toc242544612 \h </w:instrText>
+          <w:instrText xml:space="preserve"> PAGEREF _Toc242544763 \h </w:instrText>
         </w:r>
         <w:r>
           <w:rPr>
@@ -898,7 +898,7 @@
           <w14:ligatures w14:val="standardContextual"/>
         </w:rPr>
       </w:pPr>
-      <w:hyperlink w:anchor="_Toc242544613" w:history="1">
+      <w:hyperlink w:anchor="_Toc242544764" w:history="1">
         <w:r>
           <w:rPr>
             <w:rStyle w:val="Hyperlink"/>
@@ -925,7 +925,7 @@
             <w:noProof/>
             <w:webHidden/>
           </w:rPr>
-          <w:instrText xml:space="preserve"> PAGEREF _Toc242544613 \h </w:instrText>
+          <w:instrText xml:space="preserve"> PAGEREF _Toc242544764 \h </w:instrText>
         </w:r>
         <w:r>
           <w:rPr>
@@ -971,7 +971,7 @@
           <w14:ligatures w14:val="standardContextual"/>
         </w:rPr>
       </w:pPr>
-      <w:hyperlink w:anchor="_Toc242544614" w:history="1">
+      <w:hyperlink w:anchor="_Toc242544765" w:history="1">
         <w:r>
           <w:rPr>
             <w:rStyle w:val="Hyperlink"/>
@@ -998,7 +998,7 @@
             <w:noProof/>
             <w:webHidden/>
           </w:rPr>
-          <w:instrText xml:space="preserve"> PAGEREF _Toc242544614 \h </w:instrText>
+          <w:instrText xml:space="preserve"> PAGEREF _Toc242544765 \h </w:instrText>
         </w:r>
         <w:r>
           <w:rPr>
@@ -1043,7 +1043,7 @@
           <w14:ligatures w14:val="standardContextual"/>
         </w:rPr>
       </w:pPr>
-      <w:hyperlink w:anchor="_Toc242544615" w:history="1">
+      <w:hyperlink w:anchor="_Toc242544766" w:history="1">
         <w:r>
           <w:rPr>
             <w:rStyle w:val="Hyperlink"/>
@@ -1070,7 +1070,7 @@
             <w:noProof/>
             <w:webHidden/>
           </w:rPr>
-          <w:instrText xml:space="preserve"> PAGEREF _Toc242544615 \h </w:instrText>
+          <w:instrText xml:space="preserve"> PAGEREF _Toc242544766 \h </w:instrText>
         </w:r>
         <w:r>
           <w:rPr>
@@ -1115,7 +1115,7 @@
           <w14:ligatures w14:val="standardContextual"/>
         </w:rPr>
       </w:pPr>
-      <w:hyperlink w:anchor="_Toc242544616" w:history="1">
+      <w:hyperlink w:anchor="_Toc242544767" w:history="1">
         <w:r>
           <w:rPr>
             <w:rStyle w:val="Hyperlink"/>
@@ -1142,7 +1142,7 @@
             <w:noProof/>
             <w:webHidden/>
           </w:rPr>
-          <w:instrText xml:space="preserve"> PAGEREF _Toc242544616 \h </w:instrText>
+          <w:instrText xml:space="preserve"> PAGEREF _Toc242544767 \h </w:instrText>
         </w:r>
         <w:r>
           <w:rPr>
@@ -1188,7 +1188,7 @@
           <w14:ligatures w14:val="standardContextual"/>
         </w:rPr>
       </w:pPr>
-      <w:hyperlink w:anchor="_Toc242544617" w:history="1">
+      <w:hyperlink w:anchor="_Toc242544768" w:history="1">
         <w:r>
           <w:rPr>
             <w:rStyle w:val="Hyperlink"/>
@@ -1215,7 +1215,7 @@
             <w:noProof/>
             <w:webHidden/>
           </w:rPr>
-          <w:instrText xml:space="preserve"> PAGEREF _Toc242544617 \h </w:instrText>
+          <w:instrText xml:space="preserve"> PAGEREF _Toc242544768 \h </w:instrText>
         </w:r>
         <w:r>
           <w:rPr>
@@ -1260,7 +1260,7 @@
           <w14:ligatures w14:val="standardContextual"/>
         </w:rPr>
       </w:pPr>
-      <w:hyperlink w:anchor="_Toc242544618" w:history="1">
+      <w:hyperlink w:anchor="_Toc242544769" w:history="1">
         <w:r>
           <w:rPr>
             <w:rStyle w:val="Hyperlink"/>
@@ -1287,7 +1287,7 @@
             <w:noProof/>
             <w:webHidden/>
           </w:rPr>
-          <w:instrText xml:space="preserve"> PAGEREF _Toc242544618 \h </w:instrText>
+          <w:instrText xml:space="preserve"> PAGEREF _Toc242544769 \h </w:instrText>
         </w:r>
         <w:r>
           <w:rPr>
@@ -1332,7 +1332,7 @@
           <w14:ligatures w14:val="standardContextual"/>
         </w:rPr>
       </w:pPr>
-      <w:hyperlink w:anchor="_Toc242544619" w:history="1">
+      <w:hyperlink w:anchor="_Toc242544770" w:history="1">
         <w:r>
           <w:rPr>
             <w:rStyle w:val="Hyperlink"/>
@@ -1359,7 +1359,7 @@
             <w:noProof/>
             <w:webHidden/>
           </w:rPr>
-          <w:instrText xml:space="preserve"> PAGEREF _Toc242544619 \h </w:instrText>
+          <w:instrText xml:space="preserve"> PAGEREF _Toc242544770 \h </w:instrText>
         </w:r>
         <w:r>
           <w:rPr>
@@ -1404,7 +1404,7 @@
           <w14:ligatures w14:val="standardContextual"/>
         </w:rPr>
       </w:pPr>
-      <w:hyperlink w:anchor="_Toc242544620" w:history="1">
+      <w:hyperlink w:anchor="_Toc242544771" w:history="1">
         <w:r>
           <w:rPr>
             <w:rStyle w:val="Hyperlink"/>
@@ -1431,7 +1431,7 @@
             <w:noProof/>
             <w:webHidden/>
           </w:rPr>
-          <w:instrText xml:space="preserve"> PAGEREF _Toc242544620 \h </w:instrText>
+          <w:instrText xml:space="preserve"> PAGEREF _Toc242544771 \h </w:instrText>
         </w:r>
         <w:r>
           <w:rPr>
@@ -1476,7 +1476,7 @@
           <w14:ligatures w14:val="standardContextual"/>
         </w:rPr>
       </w:pPr>
-      <w:hyperlink w:anchor="_Toc242544621" w:history="1">
+      <w:hyperlink w:anchor="_Toc242544772" w:history="1">
         <w:r>
           <w:rPr>
             <w:rStyle w:val="Hyperlink"/>
@@ -1503,7 +1503,7 @@
             <w:noProof/>
             <w:webHidden/>
           </w:rPr>
-          <w:instrText xml:space="preserve"> PAGEREF _Toc242544621 \h </w:instrText>
+          <w:instrText xml:space="preserve"> PAGEREF _Toc242544772 \h </w:instrText>
         </w:r>
         <w:r>
           <w:rPr>
@@ -1549,7 +1549,7 @@
           <w14:ligatures w14:val="standardContextual"/>
         </w:rPr>
       </w:pPr>
-      <w:hyperlink w:anchor="_Toc242544622" w:history="1">
+      <w:hyperlink w:anchor="_Toc242544773" w:history="1">
         <w:r>
           <w:rPr>
             <w:rStyle w:val="Hyperlink"/>
@@ -1576,7 +1576,7 @@
             <w:noProof/>
             <w:webHidden/>
           </w:rPr>
-          <w:instrText xml:space="preserve"> PAGEREF _Toc242544622 \h </w:instrText>
+          <w:instrText xml:space="preserve"> PAGEREF _Toc242544773 \h </w:instrText>
         </w:r>
         <w:r>
           <w:rPr>
@@ -1621,7 +1621,7 @@
           <w14:ligatures w14:val="standardContextual"/>
         </w:rPr>
       </w:pPr>
-      <w:hyperlink w:anchor="_Toc242544623" w:history="1">
+      <w:hyperlink w:anchor="_Toc242544774" w:history="1">
         <w:r>
           <w:rPr>
             <w:rStyle w:val="Hyperlink"/>
@@ -1648,7 +1648,7 @@
             <w:noProof/>
             <w:webHidden/>
           </w:rPr>
-          <w:instrText xml:space="preserve"> PAGEREF _Toc242544623 \h </w:instrText>
+          <w:instrText xml:space="preserve"> PAGEREF _Toc242544774 \h </w:instrText>
         </w:r>
         <w:r>
           <w:rPr>
@@ -1693,7 +1693,7 @@
           <w14:ligatures w14:val="standardContextual"/>
         </w:rPr>
       </w:pPr>
-      <w:hyperlink w:anchor="_Toc242544624" w:history="1">
+      <w:hyperlink w:anchor="_Toc242544775" w:history="1">
         <w:r>
           <w:rPr>
             <w:rStyle w:val="Hyperlink"/>
@@ -1720,7 +1720,7 @@
             <w:noProof/>
             <w:webHidden/>
           </w:rPr>
-          <w:instrText xml:space="preserve"> PAGEREF _Toc242544624 \h </w:instrText>
+          <w:instrText xml:space="preserve"> PAGEREF _Toc242544775 \h </w:instrText>
         </w:r>
         <w:r>
           <w:rPr>
@@ -1765,7 +1765,7 @@
           <w14:ligatures w14:val="standardContextual"/>
         </w:rPr>
       </w:pPr>
-      <w:hyperlink w:anchor="_Toc242544625" w:history="1">
+      <w:hyperlink w:anchor="_Toc242544776" w:history="1">
         <w:r>
           <w:rPr>
             <w:rStyle w:val="Hyperlink"/>
@@ -1792,7 +1792,7 @@
             <w:noProof/>
             <w:webHidden/>
           </w:rPr>
-          <w:instrText xml:space="preserve"> PAGEREF _Toc242544625 \h </w:instrText>
+          <w:instrText xml:space="preserve"> PAGEREF _Toc242544776 \h </w:instrText>
         </w:r>
         <w:r>
           <w:rPr>
@@ -1837,7 +1837,7 @@
           <w14:ligatures w14:val="standardContextual"/>
         </w:rPr>
       </w:pPr>
-      <w:hyperlink w:anchor="_Toc242544626" w:history="1">
+      <w:hyperlink w:anchor="_Toc242544777" w:history="1">
         <w:r>
           <w:rPr>
             <w:rStyle w:val="Hyperlink"/>
@@ -1864,7 +1864,7 @@
             <w:noProof/>
             <w:webHidden/>
           </w:rPr>
-          <w:instrText xml:space="preserve"> PAGEREF _Toc242544626 \h </w:instrText>
+          <w:instrText xml:space="preserve"> PAGEREF _Toc242544777 \h </w:instrText>
         </w:r>
         <w:r>
           <w:rPr>
@@ -1909,7 +1909,7 @@
           <w14:ligatures w14:val="standardContextual"/>
         </w:rPr>
       </w:pPr>
-      <w:hyperlink w:anchor="_Toc242544627" w:history="1">
+      <w:hyperlink w:anchor="_Toc242544778" w:history="1">
         <w:r>
           <w:rPr>
             <w:rStyle w:val="Hyperlink"/>
@@ -1936,7 +1936,7 @@
             <w:noProof/>
             <w:webHidden/>
           </w:rPr>
-          <w:instrText xml:space="preserve"> PAGEREF _Toc242544627 \h </w:instrText>
+          <w:instrText xml:space="preserve"> PAGEREF _Toc242544778 \h </w:instrText>
         </w:r>
         <w:r>
           <w:rPr>
@@ -1981,7 +1981,7 @@
           <w14:ligatures w14:val="standardContextual"/>
         </w:rPr>
       </w:pPr>
-      <w:hyperlink w:anchor="_Toc242544628" w:history="1">
+      <w:hyperlink w:anchor="_Toc242544779" w:history="1">
         <w:r>
           <w:rPr>
             <w:rStyle w:val="Hyperlink"/>
@@ -2008,7 +2008,7 @@
             <w:noProof/>
             <w:webHidden/>
           </w:rPr>
-          <w:instrText xml:space="preserve"> PAGEREF _Toc242544628 \h </w:instrText>
+          <w:instrText xml:space="preserve"> PAGEREF _Toc242544779 \h </w:instrText>
         </w:r>
         <w:r>
           <w:rPr>
@@ -2053,7 +2053,7 @@
           <w14:ligatures w14:val="standardContextual"/>
         </w:rPr>
       </w:pPr>
-      <w:hyperlink w:anchor="_Toc242544629" w:history="1">
+      <w:hyperlink w:anchor="_Toc242544780" w:history="1">
         <w:r>
           <w:rPr>
             <w:rStyle w:val="Hyperlink"/>
@@ -2080,7 +2080,7 @@
             <w:noProof/>
             <w:webHidden/>
           </w:rPr>
-          <w:instrText xml:space="preserve"> PAGEREF _Toc242544629 \h </w:instrText>
+          <w:instrText xml:space="preserve"> PAGEREF _Toc242544780 \h </w:instrText>
         </w:r>
         <w:r>
           <w:rPr>
@@ -2126,7 +2126,7 @@
           <w14:ligatures w14:val="standardContextual"/>
         </w:rPr>
       </w:pPr>
-      <w:hyperlink w:anchor="_Toc242544630" w:history="1">
+      <w:hyperlink w:anchor="_Toc242544781" w:history="1">
         <w:r>
           <w:rPr>
             <w:rStyle w:val="Hyperlink"/>
@@ -2153,7 +2153,7 @@
             <w:noProof/>
             <w:webHidden/>
           </w:rPr>
-          <w:instrText xml:space="preserve"> PAGEREF _Toc242544630 \h </w:instrText>
+          <w:instrText xml:space="preserve"> PAGEREF _Toc242544781 \h </w:instrText>
         </w:r>
         <w:r>
           <w:rPr>
@@ -2198,7 +2198,7 @@
           <w14:ligatures w14:val="standardContextual"/>
         </w:rPr>
       </w:pPr>
-      <w:hyperlink w:anchor="_Toc242544631" w:history="1">
+      <w:hyperlink w:anchor="_Toc242544782" w:history="1">
         <w:r>
           <w:rPr>
             <w:rStyle w:val="Hyperlink"/>
@@ -2225,7 +2225,7 @@
             <w:noProof/>
             <w:webHidden/>
           </w:rPr>
-          <w:instrText xml:space="preserve"> PAGEREF _Toc242544631 \h </w:instrText>
+          <w:instrText xml:space="preserve"> PAGEREF _Toc242544782 \h </w:instrText>
         </w:r>
         <w:r>
           <w:rPr>
@@ -2270,7 +2270,7 @@
           <w14:ligatures w14:val="standardContextual"/>
         </w:rPr>
       </w:pPr>
-      <w:hyperlink w:anchor="_Toc242544632" w:history="1">
+      <w:hyperlink w:anchor="_Toc242544783" w:history="1">
         <w:r>
           <w:rPr>
             <w:rStyle w:val="Hyperlink"/>
@@ -2297,7 +2297,7 @@
             <w:noProof/>
             <w:webHidden/>
           </w:rPr>
-          <w:instrText xml:space="preserve"> PAGEREF _Toc242544632 \h </w:instrText>
+          <w:instrText xml:space="preserve"> PAGEREF _Toc242544783 \h </w:instrText>
         </w:r>
         <w:r>
           <w:rPr>
@@ -2342,7 +2342,7 @@
           <w14:ligatures w14:val="standardContextual"/>
         </w:rPr>
       </w:pPr>
-      <w:hyperlink w:anchor="_Toc242544633" w:history="1">
+      <w:hyperlink w:anchor="_Toc242544784" w:history="1">
         <w:r>
           <w:rPr>
             <w:rStyle w:val="Hyperlink"/>
@@ -2369,7 +2369,7 @@
             <w:noProof/>
             <w:webHidden/>
           </w:rPr>
-          <w:instrText xml:space="preserve"> PAGEREF _Toc242544633 \h </w:instrText>
+          <w:instrText xml:space="preserve"> PAGEREF _Toc242544784 \h </w:instrText>
         </w:r>
         <w:r>
           <w:rPr>
@@ -2414,7 +2414,7 @@
           <w14:ligatures w14:val="standardContextual"/>
         </w:rPr>
       </w:pPr>
-      <w:hyperlink w:anchor="_Toc242544634" w:history="1">
+      <w:hyperlink w:anchor="_Toc242544785" w:history="1">
         <w:r>
           <w:rPr>
             <w:rStyle w:val="Hyperlink"/>
@@ -2441,7 +2441,7 @@
             <w:noProof/>
             <w:webHidden/>
           </w:rPr>
-          <w:instrText xml:space="preserve"> PAGEREF _Toc242544634 \h </w:instrText>
+          <w:instrText xml:space="preserve"> PAGEREF _Toc242544785 \h </w:instrText>
         </w:r>
         <w:r>
           <w:rPr>
@@ -2486,7 +2486,7 @@
           <w14:ligatures w14:val="standardContextual"/>
         </w:rPr>
       </w:pPr>
-      <w:hyperlink w:anchor="_Toc242544635" w:history="1">
+      <w:hyperlink w:anchor="_Toc242544786" w:history="1">
         <w:r>
           <w:rPr>
             <w:rStyle w:val="Hyperlink"/>
@@ -2513,7 +2513,7 @@
             <w:noProof/>
             <w:webHidden/>
           </w:rPr>
-          <w:instrText xml:space="preserve"> PAGEREF _Toc242544635 \h </w:instrText>
+          <w:instrText xml:space="preserve"> PAGEREF _Toc242544786 \h </w:instrText>
         </w:r>
         <w:r>
           <w:rPr>
@@ -2558,7 +2558,7 @@
           <w14:ligatures w14:val="standardContextual"/>
         </w:rPr>
       </w:pPr>
-      <w:hyperlink w:anchor="_Toc242544636" w:history="1">
+      <w:hyperlink w:anchor="_Toc242544787" w:history="1">
         <w:r>
           <w:rPr>
             <w:rStyle w:val="Hyperlink"/>
@@ -2585,7 +2585,7 @@
             <w:noProof/>
             <w:webHidden/>
           </w:rPr>
-          <w:instrText xml:space="preserve"> PAGEREF _Toc242544636 \h </w:instrText>
+          <w:instrText xml:space="preserve"> PAGEREF _Toc242544787 \h </w:instrText>
         </w:r>
         <w:r>
           <w:rPr>
@@ -2630,7 +2630,7 @@
           <w14:ligatures w14:val="standardContextual"/>
         </w:rPr>
       </w:pPr>
-      <w:hyperlink w:anchor="_Toc242544637" w:history="1">
+      <w:hyperlink w:anchor="_Toc242544788" w:history="1">
         <w:r>
           <w:rPr>
             <w:rStyle w:val="Hyperlink"/>
@@ -2657,7 +2657,7 @@
             <w:noProof/>
             <w:webHidden/>
           </w:rPr>
-          <w:instrText xml:space="preserve"> PAGEREF _Toc242544637 \h </w:instrText>
+          <w:instrText xml:space="preserve"> PAGEREF _Toc242544788 \h </w:instrText>
         </w:r>
         <w:r>
           <w:rPr>
@@ -2702,7 +2702,7 @@
           <w14:ligatures w14:val="standardContextual"/>
         </w:rPr>
       </w:pPr>
-      <w:hyperlink w:anchor="_Toc242544638" w:history="1">
+      <w:hyperlink w:anchor="_Toc242544789" w:history="1">
         <w:r>
           <w:rPr>
             <w:rStyle w:val="Hyperlink"/>
@@ -2729,7 +2729,7 @@
             <w:noProof/>
             <w:webHidden/>
           </w:rPr>
-          <w:instrText xml:space="preserve"> PAGEREF _Toc242544638 \h </w:instrText>
+          <w:instrText xml:space="preserve"> PAGEREF _Toc242544789 \h </w:instrText>
         </w:r>
         <w:r>
           <w:rPr>
@@ -2775,7 +2775,7 @@
           <w14:ligatures w14:val="standardContextual"/>
         </w:rPr>
       </w:pPr>
-      <w:hyperlink w:anchor="_Toc242544639" w:history="1">
+      <w:hyperlink w:anchor="_Toc242544790" w:history="1">
         <w:r>
           <w:rPr>
             <w:rStyle w:val="Hyperlink"/>
@@ -2802,7 +2802,7 @@
             <w:noProof/>
             <w:webHidden/>
           </w:rPr>
-          <w:instrText xml:space="preserve"> PAGEREF _Toc242544639 \h </w:instrText>
+          <w:instrText xml:space="preserve"> PAGEREF _Toc242544790 \h </w:instrText>
         </w:r>
         <w:r>
           <w:rPr>
@@ -2847,7 +2847,7 @@
           <w14:ligatures w14:val="standardContextual"/>
         </w:rPr>
       </w:pPr>
-      <w:hyperlink w:anchor="_Toc242544640" w:history="1">
+      <w:hyperlink w:anchor="_Toc242544791" w:history="1">
         <w:r>
           <w:rPr>
             <w:rStyle w:val="Hyperlink"/>
@@ -2874,7 +2874,7 @@
             <w:noProof/>
             <w:webHidden/>
           </w:rPr>
-          <w:instrText xml:space="preserve"> PAGEREF _Toc242544640 \h </w:instrText>
+          <w:instrText xml:space="preserve"> PAGEREF _Toc242544791 \h </w:instrText>
         </w:r>
         <w:r>
           <w:rPr>
@@ -2919,7 +2919,7 @@
           <w14:ligatures w14:val="standardContextual"/>
         </w:rPr>
       </w:pPr>
-      <w:hyperlink w:anchor="_Toc242544641" w:history="1">
+      <w:hyperlink w:anchor="_Toc242544792" w:history="1">
         <w:r>
           <w:rPr>
             <w:rStyle w:val="Hyperlink"/>
@@ -2946,7 +2946,7 @@
             <w:noProof/>
             <w:webHidden/>
           </w:rPr>
-          <w:instrText xml:space="preserve"> PAGEREF _Toc242544641 \h </w:instrText>
+          <w:instrText xml:space="preserve"> PAGEREF _Toc242544792 \h </w:instrText>
         </w:r>
         <w:r>
           <w:rPr>
@@ -2991,7 +2991,7 @@
           <w14:ligatures w14:val="standardContextual"/>
         </w:rPr>
       </w:pPr>
-      <w:hyperlink w:anchor="_Toc242544642" w:history="1">
+      <w:hyperlink w:anchor="_Toc242544793" w:history="1">
         <w:r>
           <w:rPr>
             <w:rStyle w:val="Hyperlink"/>
@@ -3018,7 +3018,7 @@
             <w:noProof/>
             <w:webHidden/>
           </w:rPr>
-          <w:instrText xml:space="preserve"> PAGEREF _Toc242544642 \h </w:instrText>
+          <w:instrText xml:space="preserve"> PAGEREF _Toc242544793 \h </w:instrText>
         </w:r>
         <w:r>
           <w:rPr>
@@ -3063,7 +3063,7 @@
           <w14:ligatures w14:val="standardContextual"/>
         </w:rPr>
       </w:pPr>
-      <w:hyperlink w:anchor="_Toc242544643" w:history="1">
+      <w:hyperlink w:anchor="_Toc242544794" w:history="1">
         <w:r>
           <w:rPr>
             <w:rStyle w:val="Hyperlink"/>
@@ -3090,7 +3090,7 @@
             <w:noProof/>
             <w:webHidden/>
           </w:rPr>
-          <w:instrText xml:space="preserve"> PAGEREF _Toc242544643 \h </w:instrText>
+          <w:instrText xml:space="preserve"> PAGEREF _Toc242544794 \h </w:instrText>
         </w:r>
         <w:r>
           <w:rPr>
@@ -3135,7 +3135,7 @@
           <w14:ligatures w14:val="standardContextual"/>
         </w:rPr>
       </w:pPr>
-      <w:hyperlink w:anchor="_Toc242544644" w:history="1">
+      <w:hyperlink w:anchor="_Toc242544795" w:history="1">
         <w:r>
           <w:rPr>
             <w:rStyle w:val="Hyperlink"/>
@@ -3162,7 +3162,7 @@
             <w:noProof/>
             <w:webHidden/>
           </w:rPr>
-          <w:instrText xml:space="preserve"> PAGEREF _Toc242544644 \h </w:instrText>
+          <w:instrText xml:space="preserve"> PAGEREF _Toc242544795 \h </w:instrText>
         </w:r>
         <w:r>
           <w:rPr>
@@ -3207,7 +3207,7 @@
           <w14:ligatures w14:val="standardContextual"/>
         </w:rPr>
       </w:pPr>
-      <w:hyperlink w:anchor="_Toc242544645" w:history="1">
+      <w:hyperlink w:anchor="_Toc242544796" w:history="1">
         <w:r>
           <w:rPr>
             <w:rStyle w:val="Hyperlink"/>
@@ -3234,7 +3234,7 @@
             <w:noProof/>
             <w:webHidden/>
           </w:rPr>
-          <w:instrText xml:space="preserve"> PAGEREF _Toc242544645 \h </w:instrText>
+          <w:instrText xml:space="preserve"> PAGEREF _Toc242544796 \h </w:instrText>
         </w:r>
         <w:r>
           <w:rPr>
@@ -3279,7 +3279,7 @@
           <w14:ligatures w14:val="standardContextual"/>
         </w:rPr>
       </w:pPr>
-      <w:hyperlink w:anchor="_Toc242544646" w:history="1">
+      <w:hyperlink w:anchor="_Toc242544797" w:history="1">
         <w:r>
           <w:rPr>
             <w:rStyle w:val="Hyperlink"/>
@@ -3306,7 +3306,7 @@
             <w:noProof/>
             <w:webHidden/>
           </w:rPr>
-          <w:instrText xml:space="preserve"> PAGEREF _Toc242544646 \h </w:instrText>
+          <w:instrText xml:space="preserve"> PAGEREF _Toc242544797 \h </w:instrText>
         </w:r>
         <w:r>
           <w:rPr>
@@ -3352,7 +3352,7 @@
           <w14:ligatures w14:val="standardContextual"/>
         </w:rPr>
       </w:pPr>
-      <w:hyperlink w:anchor="_Toc242544647" w:history="1">
+      <w:hyperlink w:anchor="_Toc242544798" w:history="1">
         <w:r>
           <w:rPr>
             <w:rStyle w:val="Hyperlink"/>
@@ -3379,7 +3379,7 @@
             <w:noProof/>
             <w:webHidden/>
           </w:rPr>
-          <w:instrText xml:space="preserve"> PAGEREF _Toc242544647 \h </w:instrText>
+          <w:instrText xml:space="preserve"> PAGEREF _Toc242544798 \h </w:instrText>
         </w:r>
         <w:r>
           <w:rPr>
@@ -3424,7 +3424,7 @@
           <w14:ligatures w14:val="standardContextual"/>
         </w:rPr>
       </w:pPr>
-      <w:hyperlink w:anchor="_Toc242544648" w:history="1">
+      <w:hyperlink w:anchor="_Toc242544799" w:history="1">
         <w:r>
           <w:rPr>
             <w:rStyle w:val="Hyperlink"/>
@@ -3451,7 +3451,7 @@
             <w:noProof/>
             <w:webHidden/>
           </w:rPr>
-          <w:instrText xml:space="preserve"> PAGEREF _Toc242544648 \h </w:instrText>
+          <w:instrText xml:space="preserve"> PAGEREF _Toc242544799 \h </w:instrText>
         </w:r>
         <w:r>
           <w:rPr>
@@ -3496,7 +3496,7 @@
           <w14:ligatures w14:val="standardContextual"/>
         </w:rPr>
       </w:pPr>
-      <w:hyperlink w:anchor="_Toc242544649" w:history="1">
+      <w:hyperlink w:anchor="_Toc242544800" w:history="1">
         <w:r>
           <w:rPr>
             <w:rStyle w:val="Hyperlink"/>
@@ -3523,7 +3523,7 @@
             <w:noProof/>
             <w:webHidden/>
           </w:rPr>
-          <w:instrText xml:space="preserve"> PAGEREF _Toc242544649 \h </w:instrText>
+          <w:instrText xml:space="preserve"> PAGEREF _Toc242544800 \h </w:instrText>
         </w:r>
         <w:r>
           <w:rPr>
@@ -3568,7 +3568,7 @@
           <w14:ligatures w14:val="standardContextual"/>
         </w:rPr>
       </w:pPr>
-      <w:hyperlink w:anchor="_Toc242544650" w:history="1">
+      <w:hyperlink w:anchor="_Toc242544801" w:history="1">
         <w:r>
           <w:rPr>
             <w:rStyle w:val="Hyperlink"/>
@@ -3595,7 +3595,7 @@
             <w:noProof/>
             <w:webHidden/>
           </w:rPr>
-          <w:instrText xml:space="preserve"> PAGEREF _Toc242544650 \h </w:instrText>
+          <w:instrText xml:space="preserve"> PAGEREF _Toc242544801 \h </w:instrText>
         </w:r>
         <w:r>
           <w:rPr>
@@ -3640,7 +3640,7 @@
           <w14:ligatures w14:val="standardContextual"/>
         </w:rPr>
       </w:pPr>
-      <w:hyperlink w:anchor="_Toc242544651" w:history="1">
+      <w:hyperlink w:anchor="_Toc242544802" w:history="1">
         <w:r>
           <w:rPr>
             <w:rStyle w:val="Hyperlink"/>
@@ -3667,7 +3667,7 @@
             <w:noProof/>
             <w:webHidden/>
           </w:rPr>
-          <w:instrText xml:space="preserve"> PAGEREF _Toc242544651 \h </w:instrText>
+          <w:instrText xml:space="preserve"> PAGEREF _Toc242544802 \h </w:instrText>
         </w:r>
         <w:r>
           <w:rPr>
@@ -3712,7 +3712,7 @@
           <w14:ligatures w14:val="standardContextual"/>
         </w:rPr>
       </w:pPr>
-      <w:hyperlink w:anchor="_Toc242544652" w:history="1">
+      <w:hyperlink w:anchor="_Toc242544803" w:history="1">
         <w:r>
           <w:rPr>
             <w:rStyle w:val="Hyperlink"/>
@@ -3739,7 +3739,7 @@
             <w:noProof/>
             <w:webHidden/>
           </w:rPr>
-          <w:instrText xml:space="preserve"> PAGEREF _Toc242544652 \h </w:instrText>
+          <w:instrText xml:space="preserve"> PAGEREF _Toc242544803 \h </w:instrText>
         </w:r>
         <w:r>
           <w:rPr>
@@ -3784,7 +3784,7 @@
           <w14:ligatures w14:val="standardContextual"/>
         </w:rPr>
       </w:pPr>
-      <w:hyperlink w:anchor="_Toc242544653" w:history="1">
+      <w:hyperlink w:anchor="_Toc242544804" w:history="1">
         <w:r>
           <w:rPr>
             <w:rStyle w:val="Hyperlink"/>
@@ -3811,7 +3811,7 @@
             <w:noProof/>
             <w:webHidden/>
           </w:rPr>
-          <w:instrText xml:space="preserve"> PAGEREF _Toc242544653 \h </w:instrText>
+          <w:instrText xml:space="preserve"> PAGEREF _Toc242544804 \h </w:instrText>
         </w:r>
         <w:r>
           <w:rPr>
@@ -3856,7 +3856,7 @@
           <w14:ligatures w14:val="standardContextual"/>
         </w:rPr>
       </w:pPr>
-      <w:hyperlink w:anchor="_Toc242544654" w:history="1">
+      <w:hyperlink w:anchor="_Toc242544805" w:history="1">
         <w:r>
           <w:rPr>
             <w:rStyle w:val="Hyperlink"/>
@@ -3883,7 +3883,7 @@
             <w:noProof/>
             <w:webHidden/>
           </w:rPr>
-          <w:instrText xml:space="preserve"> PAGEREF _Toc242544654 \h </w:instrText>
+          <w:instrText xml:space="preserve"> PAGEREF _Toc242544805 \h </w:instrText>
         </w:r>
         <w:r>
           <w:rPr>
@@ -3928,7 +3928,7 @@
           <w14:ligatures w14:val="standardContextual"/>
         </w:rPr>
       </w:pPr>
-      <w:hyperlink w:anchor="_Toc242544655" w:history="1">
+      <w:hyperlink w:anchor="_Toc242544806" w:history="1">
         <w:r>
           <w:rPr>
             <w:rStyle w:val="Hyperlink"/>
@@ -3955,7 +3955,7 @@
             <w:noProof/>
             <w:webHidden/>
           </w:rPr>
-          <w:instrText xml:space="preserve"> PAGEREF _Toc242544655 \h </w:instrText>
+          <w:instrText xml:space="preserve"> PAGEREF _Toc242544806 \h </w:instrText>
         </w:r>
         <w:r>
           <w:rPr>
@@ -4000,7 +4000,7 @@
           <w14:ligatures w14:val="standardContextual"/>
         </w:rPr>
       </w:pPr>
-      <w:hyperlink w:anchor="_Toc242544656" w:history="1">
+      <w:hyperlink w:anchor="_Toc242544807" w:history="1">
         <w:r>
           <w:rPr>
             <w:rStyle w:val="Hyperlink"/>
@@ -4027,7 +4027,7 @@
             <w:noProof/>
             <w:webHidden/>
           </w:rPr>
-          <w:instrText xml:space="preserve"> PAGEREF _Toc242544656 \h </w:instrText>
+          <w:instrText xml:space="preserve"> PAGEREF _Toc242544807 \h </w:instrText>
         </w:r>
         <w:r>
           <w:rPr>
@@ -4073,7 +4073,7 @@
           <w14:ligatures w14:val="standardContextual"/>
         </w:rPr>
       </w:pPr>
-      <w:hyperlink w:anchor="_Toc242544657" w:history="1">
+      <w:hyperlink w:anchor="_Toc242544808" w:history="1">
         <w:r>
           <w:rPr>
             <w:rStyle w:val="Hyperlink"/>
@@ -4100,7 +4100,7 @@
             <w:noProof/>
             <w:webHidden/>
           </w:rPr>
-          <w:instrText xml:space="preserve"> PAGEREF _Toc242544657 \h </w:instrText>
+          <w:instrText xml:space="preserve"> PAGEREF _Toc242544808 \h </w:instrText>
         </w:r>
         <w:r>
           <w:rPr>
@@ -4166,7 +4166,7 @@
       <w:pPr>
         <w:pStyle w:val="Heading1"/>
       </w:pPr>
-      <w:bookmarkStart w:id="0" w:name="_Toc242544611"/>
+      <w:bookmarkStart w:id="0" w:name="_Toc242544762"/>
       <w:r>
         <w:t>1. Group information and project title</w:t>
       </w:r>
@@ -4176,7 +4176,7 @@
       <w:pPr>
         <w:pStyle w:val="Heading2"/>
       </w:pPr>
-      <w:bookmarkStart w:id="1" w:name="_Toc242544612"/>
+      <w:bookmarkStart w:id="1" w:name="_Toc242544763"/>
       <w:r>
         <w:t>1.1 Group 85</w:t>
       </w:r>
@@ -4191,7 +4191,7 @@
       <w:pPr>
         <w:pStyle w:val="Heading2"/>
       </w:pPr>
-      <w:bookmarkStart w:id="2" w:name="_Toc242544613"/>
+      <w:bookmarkStart w:id="2" w:name="_Toc242544764"/>
       <w:r>
         <w:t>1.2 Project title</w:t>
       </w:r>
@@ -4214,7 +4214,7 @@
       <w:pPr>
         <w:pStyle w:val="Heading1"/>
       </w:pPr>
-      <w:bookmarkStart w:id="3" w:name="_Toc242544614"/>
+      <w:bookmarkStart w:id="3" w:name="_Toc242544765"/>
       <w:r>
         <w:t>2. Problem description and motivation</w:t>
       </w:r>
@@ -4224,7 +4224,7 @@
       <w:pPr>
         <w:pStyle w:val="Heading2"/>
       </w:pPr>
-      <w:bookmarkStart w:id="4" w:name="_Toc242544615"/>
+      <w:bookmarkStart w:id="4" w:name="_Toc242544766"/>
       <w:r>
         <w:t>2.1 The problem</w:t>
       </w:r>
@@ -4284,7 +4284,7 @@
       <w:pPr>
         <w:pStyle w:val="Heading2"/>
       </w:pPr>
-      <w:bookmarkStart w:id="5" w:name="_Toc242544616"/>
+      <w:bookmarkStart w:id="5" w:name="_Toc242544767"/>
       <w:r>
         <w:t>2.2 Why we chose it</w:t>
       </w:r>
@@ -4302,7 +4302,7 @@
       <w:pPr>
         <w:pStyle w:val="Heading1"/>
       </w:pPr>
-      <w:bookmarkStart w:id="6" w:name="_Toc242544617"/>
+      <w:bookmarkStart w:id="6" w:name="_Toc242544768"/>
       <w:r>
         <w:t>3. Dataset description</w:t>
       </w:r>
@@ -4312,7 +4312,7 @@
       <w:pPr>
         <w:pStyle w:val="Heading2"/>
       </w:pPr>
-      <w:bookmarkStart w:id="7" w:name="_Toc242544618"/>
+      <w:bookmarkStart w:id="7" w:name="_Toc242544769"/>
       <w:r>
         <w:t>3.1 Three sources on one grid</w:t>
       </w:r>
@@ -4799,7 +4799,7 @@
       <w:pPr>
         <w:pStyle w:val="Heading2"/>
       </w:pPr>
-      <w:bookmarkStart w:id="8" w:name="_Toc242544619"/>
+      <w:bookmarkStart w:id="8" w:name="_Toc242544770"/>
       <w:r>
         <w:t>3.2 Rows, columns and classes</w:t>
       </w:r>
@@ -5599,7 +5599,7 @@
       <w:pPr>
         <w:pStyle w:val="Heading2"/>
       </w:pPr>
-      <w:bookmarkStart w:id="9" w:name="_Toc242544620"/>
+      <w:bookmarkStart w:id="9" w:name="_Toc242544771"/>
       <w:r>
         <w:t>3.3 When the Territory burns</w:t>
       </w:r>
@@ -5672,7 +5672,7 @@
       <w:pPr>
         <w:pStyle w:val="Heading2"/>
       </w:pPr>
-      <w:bookmarkStart w:id="10" w:name="_Toc242544621"/>
+      <w:bookmarkStart w:id="10" w:name="_Toc242544772"/>
       <w:r>
         <w:t>3.4 Fire and rain, year by year</w:t>
       </w:r>
@@ -5767,7 +5767,7 @@
       <w:pPr>
         <w:pStyle w:val="Heading1"/>
       </w:pPr>
-      <w:bookmarkStart w:id="11" w:name="_Toc242544622"/>
+      <w:bookmarkStart w:id="11" w:name="_Toc242544773"/>
       <w:r>
         <w:t>4. Dataset analysis, feature selection, transformation, preprocessing and engineering</w:t>
       </w:r>
@@ -5782,7 +5782,7 @@
       <w:pPr>
         <w:pStyle w:val="Heading2"/>
       </w:pPr>
-      <w:bookmarkStart w:id="12" w:name="_Toc242544623"/>
+      <w:bookmarkStart w:id="12" w:name="_Toc242544774"/>
       <w:r>
         <w:t>4.1 Where it burns</w:t>
       </w:r>
@@ -5910,7 +5910,7 @@
       <w:pPr>
         <w:pStyle w:val="Heading2"/>
       </w:pPr>
-      <w:bookmarkStart w:id="13" w:name="_Toc242544624"/>
+      <w:bookmarkStart w:id="13" w:name="_Toc242544775"/>
       <w:r>
         <w:t>4.2 Fire history and the wet season together</w:t>
       </w:r>
@@ -5991,7 +5991,7 @@
       <w:pPr>
         <w:pStyle w:val="Heading2"/>
       </w:pPr>
-      <w:bookmarkStart w:id="14" w:name="_Toc242544625"/>
+      <w:bookmarkStart w:id="14" w:name="_Toc242544776"/>
       <w:r>
         <w:t>4.3 The shape of the inputs and how we transformed them</w:t>
       </w:r>
@@ -6074,7 +6074,7 @@
       <w:pPr>
         <w:pStyle w:val="Heading2"/>
       </w:pPr>
-      <w:bookmarkStart w:id="15" w:name="_Toc242544626"/>
+      <w:bookmarkStart w:id="15" w:name="_Toc242544777"/>
       <w:r>
         <w:t>4.4 How the inputs relate to each other</w:t>
       </w:r>
@@ -6152,7 +6152,7 @@
       <w:pPr>
         <w:pStyle w:val="Heading2"/>
       </w:pPr>
-      <w:bookmarkStart w:id="16" w:name="_Toc242544627"/>
+      <w:bookmarkStart w:id="16" w:name="_Toc242544778"/>
       <w:r>
         <w:t>4.5 Fire regions found by k-means clustering</w:t>
       </w:r>
@@ -6233,7 +6233,7 @@
       <w:pPr>
         <w:pStyle w:val="Heading2"/>
       </w:pPr>
-      <w:bookmarkStart w:id="17" w:name="_Toc242544628"/>
+      <w:bookmarkStart w:id="17" w:name="_Toc242544779"/>
       <w:r>
         <w:t>4.6 Preprocessing: from pixels to labels</w:t>
       </w:r>
@@ -6316,7 +6316,7 @@
       <w:pPr>
         <w:pStyle w:val="Heading2"/>
       </w:pPr>
-      <w:bookmarkStart w:id="18" w:name="_Toc242544629"/>
+      <w:bookmarkStart w:id="18" w:name="_Toc242544780"/>
       <w:r>
         <w:t>4.7 Feature engineering and selection</w:t>
       </w:r>
@@ -6793,7 +6793,7 @@
       <w:pPr>
         <w:pStyle w:val="Heading1"/>
       </w:pPr>
-      <w:bookmarkStart w:id="19" w:name="_Toc242544630"/>
+      <w:bookmarkStart w:id="19" w:name="_Toc242544781"/>
       <w:r>
         <w:t>5. Choice and description of the algorithms</w:t>
       </w:r>
@@ -6803,7 +6803,7 @@
       <w:pPr>
         <w:pStyle w:val="Heading2"/>
       </w:pPr>
-      <w:bookmarkStart w:id="20" w:name="_Toc242544631"/>
+      <w:bookmarkStart w:id="20" w:name="_Toc242544782"/>
       <w:r>
         <w:t>5.1 Why these six</w:t>
       </w:r>
@@ -6826,7 +6826,7 @@
       <w:pPr>
         <w:pStyle w:val="Heading2"/>
       </w:pPr>
-      <w:bookmarkStart w:id="21" w:name="_Toc242544632"/>
+      <w:bookmarkStart w:id="21" w:name="_Toc242544783"/>
       <w:r>
         <w:t>5.2 Decision tree</w:t>
       </w:r>
@@ -6844,7 +6844,7 @@
       <w:pPr>
         <w:pStyle w:val="Heading2"/>
       </w:pPr>
-      <w:bookmarkStart w:id="22" w:name="_Toc242544633"/>
+      <w:bookmarkStart w:id="22" w:name="_Toc242544784"/>
       <w:r>
         <w:t>5.3 Random forest</w:t>
       </w:r>
@@ -6859,7 +6859,7 @@
       <w:pPr>
         <w:pStyle w:val="Heading2"/>
       </w:pPr>
-      <w:bookmarkStart w:id="23" w:name="_Toc242544634"/>
+      <w:bookmarkStart w:id="23" w:name="_Toc242544785"/>
       <w:r>
         <w:t>5.4 Naive Bayes</w:t>
       </w:r>
@@ -6877,7 +6877,7 @@
       <w:pPr>
         <w:pStyle w:val="Heading2"/>
       </w:pPr>
-      <w:bookmarkStart w:id="24" w:name="_Toc242544635"/>
+      <w:bookmarkStart w:id="24" w:name="_Toc242544786"/>
       <w:r>
         <w:t>5.5 Gradient boosting</w:t>
       </w:r>
@@ -6895,7 +6895,7 @@
       <w:pPr>
         <w:pStyle w:val="Heading2"/>
       </w:pPr>
-      <w:bookmarkStart w:id="25" w:name="_Toc242544636"/>
+      <w:bookmarkStart w:id="25" w:name="_Toc242544787"/>
       <w:r>
         <w:t>5.6 Multilayer ANN</w:t>
       </w:r>
@@ -6913,7 +6913,7 @@
       <w:pPr>
         <w:pStyle w:val="Heading2"/>
       </w:pPr>
-      <w:bookmarkStart w:id="26" w:name="_Toc242544637"/>
+      <w:bookmarkStart w:id="26" w:name="_Toc242544788"/>
       <w:r>
         <w:t>5.7 LSTM</w:t>
       </w:r>
@@ -6931,7 +6931,7 @@
       <w:pPr>
         <w:pStyle w:val="Heading2"/>
       </w:pPr>
-      <w:bookmarkStart w:id="27" w:name="_Toc242544638"/>
+      <w:bookmarkStart w:id="27" w:name="_Toc242544789"/>
       <w:r>
         <w:t>5.8 Key steps</w:t>
       </w:r>
@@ -8161,7 +8161,7 @@
       <w:pPr>
         <w:pStyle w:val="Heading1"/>
       </w:pPr>
-      <w:bookmarkStart w:id="28" w:name="_Toc242544639"/>
+      <w:bookmarkStart w:id="28" w:name="_Toc242544790"/>
       <w:r>
         <w:t>6. Overview of model evaluation measures</w:t>
       </w:r>
@@ -8171,7 +8171,7 @@
       <w:pPr>
         <w:pStyle w:val="Heading2"/>
       </w:pPr>
-      <w:bookmarkStart w:id="29" w:name="_Toc242544640"/>
+      <w:bookmarkStart w:id="29" w:name="_Toc242544791"/>
       <w:r>
         <w:t>6.1 The confusion matrix</w:t>
       </w:r>
@@ -8241,7 +8241,7 @@
       <w:pPr>
         <w:pStyle w:val="Heading2"/>
       </w:pPr>
-      <w:bookmarkStart w:id="30" w:name="_Toc242544641"/>
+      <w:bookmarkStart w:id="30" w:name="_Toc242544792"/>
       <w:r>
         <w:t>6.2 Accuracy</w:t>
       </w:r>
@@ -8256,7 +8256,7 @@
       <w:pPr>
         <w:pStyle w:val="Heading2"/>
       </w:pPr>
-      <w:bookmarkStart w:id="31" w:name="_Toc242544642"/>
+      <w:bookmarkStart w:id="31" w:name="_Toc242544793"/>
       <w:r>
         <w:t>6.3 Precision</w:t>
       </w:r>
@@ -8271,7 +8271,7 @@
       <w:pPr>
         <w:pStyle w:val="Heading2"/>
       </w:pPr>
-      <w:bookmarkStart w:id="32" w:name="_Toc242544643"/>
+      <w:bookmarkStart w:id="32" w:name="_Toc242544794"/>
       <w:r>
         <w:t>6.4 Recall</w:t>
       </w:r>
@@ -8286,7 +8286,7 @@
       <w:pPr>
         <w:pStyle w:val="Heading2"/>
       </w:pPr>
-      <w:bookmarkStart w:id="33" w:name="_Toc242544644"/>
+      <w:bookmarkStart w:id="33" w:name="_Toc242544795"/>
       <w:r>
         <w:t>6.5 F1 score and macro averaging</w:t>
       </w:r>
@@ -8301,7 +8301,7 @@
       <w:pPr>
         <w:pStyle w:val="Heading2"/>
       </w:pPr>
-      <w:bookmarkStart w:id="34" w:name="_Toc242544645"/>
+      <w:bookmarkStart w:id="34" w:name="_Toc242544796"/>
       <w:r>
         <w:t>6.6 Scoring the probabilities</w:t>
       </w:r>
@@ -8316,7 +8316,7 @@
       <w:pPr>
         <w:pStyle w:val="Heading2"/>
       </w:pPr>
-      <w:bookmarkStart w:id="35" w:name="_Toc242544646"/>
+      <w:bookmarkStart w:id="35" w:name="_Toc242544797"/>
       <w:r>
         <w:t>6.7 Overfitting checks</w:t>
       </w:r>
@@ -8353,7 +8353,7 @@
       <w:pPr>
         <w:pStyle w:val="Heading1"/>
       </w:pPr>
-      <w:bookmarkStart w:id="36" w:name="_Toc242544647"/>
+      <w:bookmarkStart w:id="36" w:name="_Toc242544798"/>
       <w:r>
         <w:t>7. Results and our overall understanding</w:t>
       </w:r>
@@ -8363,7 +8363,7 @@
       <w:pPr>
         <w:pStyle w:val="Heading2"/>
       </w:pPr>
-      <w:bookmarkStart w:id="37" w:name="_Toc242544648"/>
+      <w:bookmarkStart w:id="37" w:name="_Toc242544799"/>
       <w:r>
         <w:t>7.1 How the six models compare</w:t>
       </w:r>
@@ -9929,7 +9929,7 @@
       <w:pPr>
         <w:pStyle w:val="Heading2"/>
       </w:pPr>
-      <w:bookmarkStart w:id="38" w:name="_Toc242544649"/>
+      <w:bookmarkStart w:id="38" w:name="_Toc242544800"/>
       <w:r>
         <w:t>7.2 Precision and recall class by class</w:t>
       </w:r>
@@ -10062,7 +10062,7 @@
       <w:pPr>
         <w:pStyle w:val="Heading2"/>
       </w:pPr>
-      <w:bookmarkStart w:id="39" w:name="_Toc242544650"/>
+      <w:bookmarkStart w:id="39" w:name="_Toc242544801"/>
       <w:r>
         <w:t>7.3 What class weighting did</w:t>
       </w:r>
@@ -10080,7 +10080,7 @@
       <w:pPr>
         <w:pStyle w:val="Heading2"/>
       </w:pPr>
-      <w:bookmarkStart w:id="40" w:name="_Toc242544651"/>
+      <w:bookmarkStart w:id="40" w:name="_Toc242544802"/>
       <w:r>
         <w:t>7.4 Overfitting</w:t>
       </w:r>
@@ -10153,7 +10153,7 @@
       <w:pPr>
         <w:pStyle w:val="Heading2"/>
       </w:pPr>
-      <w:bookmarkStart w:id="41" w:name="_Toc242544652"/>
+      <w:bookmarkStart w:id="41" w:name="_Toc242544803"/>
       <w:r>
         <w:t>7.5 Testing it sixty-six times</w:t>
       </w:r>
@@ -10231,7 +10231,7 @@
       <w:pPr>
         <w:pStyle w:val="Heading2"/>
       </w:pPr>
-      <w:bookmarkStart w:id="42" w:name="_Toc242544653"/>
+      <w:bookmarkStart w:id="42" w:name="_Toc242544804"/>
       <w:r>
         <w:t>7.6 What the model relies on</w:t>
       </w:r>
@@ -10309,7 +10309,7 @@
       <w:pPr>
         <w:pStyle w:val="Heading2"/>
       </w:pPr>
-      <w:bookmarkStart w:id="43" w:name="_Toc242544654"/>
+      <w:bookmarkStart w:id="43" w:name="_Toc242544805"/>
       <w:r>
         <w:t>7.7 The 2026 forecast</w:t>
       </w:r>
@@ -10382,7 +10382,7 @@
       <w:pPr>
         <w:pStyle w:val="Heading2"/>
       </w:pPr>
-      <w:bookmarkStart w:id="44" w:name="_Toc242544655"/>
+      <w:bookmarkStart w:id="44" w:name="_Toc242544806"/>
       <w:r>
         <w:t>7.8 Our overall understanding</w:t>
       </w:r>
@@ -10418,7 +10418,7 @@
       <w:pPr>
         <w:pStyle w:val="Heading2"/>
       </w:pPr>
-      <w:bookmarkStart w:id="45" w:name="_Toc242544656"/>
+      <w:bookmarkStart w:id="45" w:name="_Toc242544807"/>
       <w:r>
         <w:t>7.9 Limitations</w:t>
       </w:r>
@@ -10437,7 +10437,7 @@
         <w:pStyle w:val="Heading1"/>
         <w:pageBreakBefore/>
       </w:pPr>
-      <w:bookmarkStart w:id="46" w:name="_Toc242544657"/>
+      <w:bookmarkStart w:id="46" w:name="_Toc242544808"/>
       <w:r>
         <w:t>References</w:t>
       </w:r>
@@ -11280,31 +11280,31 @@
       </w:rPr>
     </w:lvl>
   </w:abstractNum>
-  <w:num w:numId="1" w16cid:durableId="916398385">
+  <w:num w:numId="1" w16cid:durableId="2096003734">
     <w:abstractNumId w:val="8"/>
   </w:num>
-  <w:num w:numId="2" w16cid:durableId="1818645104">
+  <w:num w:numId="2" w16cid:durableId="1662853608">
     <w:abstractNumId w:val="6"/>
   </w:num>
-  <w:num w:numId="3" w16cid:durableId="1959558917">
+  <w:num w:numId="3" w16cid:durableId="2146193998">
     <w:abstractNumId w:val="5"/>
   </w:num>
-  <w:num w:numId="4" w16cid:durableId="1955625062">
+  <w:num w:numId="4" w16cid:durableId="1426225167">
     <w:abstractNumId w:val="4"/>
   </w:num>
-  <w:num w:numId="5" w16cid:durableId="88815897">
+  <w:num w:numId="5" w16cid:durableId="2038307845">
     <w:abstractNumId w:val="7"/>
   </w:num>
-  <w:num w:numId="6" w16cid:durableId="13654605">
+  <w:num w:numId="6" w16cid:durableId="297806552">
     <w:abstractNumId w:val="3"/>
   </w:num>
-  <w:num w:numId="7" w16cid:durableId="337122661">
+  <w:num w:numId="7" w16cid:durableId="1338456494">
     <w:abstractNumId w:val="2"/>
   </w:num>
-  <w:num w:numId="8" w16cid:durableId="1181358176">
+  <w:num w:numId="8" w16cid:durableId="278489039">
     <w:abstractNumId w:val="1"/>
   </w:num>
-  <w:num w:numId="9" w16cid:durableId="730345437">
+  <w:num w:numId="9" w16cid:durableId="1722630586">
     <w:abstractNumId w:val="0"/>
   </w:num>
 </w:numbering>
@@ -22719,7 +22719,7 @@
     <w:basedOn w:val="DefaultParagraphFont"/>
     <w:uiPriority w:val="99"/>
     <w:unhideWhenUsed/>
-    <w:rsid w:val="001C7E30"/>
+    <w:rsid w:val="009D58A4"/>
     <w:rPr>
       <w:color w:val="0000FF" w:themeColor="hyperlink"/>
       <w:u w:val="single"/>

</xml_diff>